<commit_message>
./help: запуск из PowerShell (help.cmd + helper/help.ps1); отчёт ЛР1 через ./help
- help.cmd вызывает helper/help.ps1 с -ExecutionPolicy Bypass: та же логика, что у h,
  без Git Bash и perl (вывод psql побайтно совпадает с ./h)
- отчёт ЛР1 (варианты 20 и 22): раздел защиты, справка, листинги и вывод - через ./help;
  вывод ЛР1 переснят (capture.sh: caph), check_reports.py проверяет ЛР1 по ./help
- ранее подготовленные изменения: раздел «Защита работы» и приложение со сценарием h
  во всех отчётах, параметры ЛР7 по вариантам
</commit_message>
<xml_diff>
--- a/reports/docx/ЛР2_вариант_20.docx
+++ b/reports/docx/ЛР2_вариант_20.docx
@@ -1560,7 +1560,7 @@
           <w:i/>
           <w:sz w:val="24"/>
         </w:rPr>
-        <w:t>Листинг 3 – выполнение генерации: &gt;s.bat lab2\add_data.sql 2000000</w:t>
+        <w:t>Листинг 3 – выполнение генерации: ./h lr2 gen (аналог в cmd: &gt;s.bat lab2\add_data.sql 2000000)</w:t>
       </w:r>
     </w:p>
     <w:tbl>
@@ -2644,7 +2644,7 @@
           <w:i/>
           <w:sz w:val="24"/>
         </w:rPr>
-        <w:t>Листинг 9 – замеры через CURRENT_TIME: &gt;s.bat lab2\time_current.sql 20</w:t>
+        <w:t>Листинг 9 – замеры через CURRENT_TIME: ./h lr2 time 20 (аналог в cmd: &gt;s.bat lab2\time_current.sql 20)</w:t>
       </w:r>
     </w:p>
     <w:tbl>
@@ -3160,7 +3160,7 @@
           <w:i/>
           <w:sz w:val="24"/>
         </w:rPr>
-        <w:t>Листинг 11 – замеры командой \timing on: &gt;s.bat lab2\time_timing.sql 20</w:t>
+        <w:t>Листинг 11 – замеры командой \timing on: ./h lr2 timing 20 (аналог в cmd: &gt;s.bat lab2\time_timing.sql 20)</w:t>
       </w:r>
     </w:p>
     <w:tbl>
@@ -3769,7 +3769,7 @@
           <w:i/>
           <w:sz w:val="24"/>
         </w:rPr>
-        <w:t>Листинг 13 – индексы в исходном состоянии</w:t>
+        <w:t>Листинг 13 – индексы в исходном состоянии: ./h lr2 idx 20</w:t>
       </w:r>
     </w:p>
     <w:tbl>
@@ -4263,7 +4263,7 @@
           <w:i/>
           <w:sz w:val="24"/>
         </w:rPr>
-        <w:t>Листинг 16 – создание btree-индекса: &gt;s.bat lab2\idx_1.sql 20 btree</w:t>
+        <w:t>Листинг 16 – создание btree-индекса: ./h lr2 idx1 20 btree (аналог в cmd: &gt;s.bat lab2\idx_1.sql 20 btree)</w:t>
       </w:r>
     </w:p>
     <w:tbl>
@@ -4517,7 +4517,7 @@
           <w:i/>
           <w:sz w:val="24"/>
         </w:rPr>
-        <w:t>Листинг 17 – удаление индекса: &gt;s.bat lab2\idx_0.sql 20</w:t>
+        <w:t>Листинг 17 – удаление индекса: ./h lr2 idx0 20 (аналог в cmd: &gt;s.bat lab2\idx_0.sql 20)</w:t>
       </w:r>
     </w:p>
     <w:tbl>
@@ -5577,7 +5577,7 @@
           <w:i/>
           <w:sz w:val="24"/>
         </w:rPr>
-        <w:t>Листинг 21 – справочник без ключа: &gt;s.bat lab2\create_ref1.sql 20</w:t>
+        <w:t>Листинг 21 – справочник без ключа: ./h lr2 pk0 20 (аналог в cmd: &gt;s.bat lab2\create_ref1.sql 20)</w:t>
       </w:r>
     </w:p>
     <w:tbl>
@@ -5819,7 +5819,7 @@
           <w:i/>
           <w:sz w:val="24"/>
         </w:rPr>
-        <w:t>Листинг 22 – справочник с ключом: &gt;s.bat lab2\create_ref0.sql 20</w:t>
+        <w:t>Листинг 22 – справочник с ключом: ./h lr2 pk1 20 (аналог в cmd: &gt;s.bat lab2\create_ref0.sql 20)</w:t>
       </w:r>
     </w:p>
     <w:tbl>
@@ -6383,7 +6383,7 @@
           <w:i/>
           <w:sz w:val="24"/>
         </w:rPr>
-        <w:t>Листинг 24 – план запроса с условием WHERE и btree-индексом: &gt;s.bat lab2\explain.sql 20 1</w:t>
+        <w:t>Листинг 24 – план запроса с условием WHERE и btree-индексом: ./h lr2 explain 20 1 (аналог в cmd: &gt;s.bat lab2\explain.sql 20 1)</w:t>
       </w:r>
     </w:p>
     <w:tbl>
@@ -9327,7 +9327,1263 @@
         <w:pStyle w:val="Heading1"/>
       </w:pPr>
       <w:r>
-        <w:t>5. Выводы</w:t>
+        <w:t>5. Защита работы: запуск через ./h</w:t>
+      </w:r>
+    </w:p>
+    <w:p>
+      <w:pPr>
+        <w:ind w:firstLine="709"/>
+        <w:jc w:val="both"/>
+      </w:pPr>
+      <w:r>
+        <w:rPr>
+          <w:b w:val="0"/>
+        </w:rPr>
+        <w:t xml:space="preserve">Все действия работы выполняются из корня проекта в Git Bash единым сценарием </w:t>
+      </w:r>
+      <w:r>
+        <w:rPr>
+          <w:b/>
+        </w:rPr>
+        <w:t>h</w:t>
+      </w:r>
+      <w:r>
+        <w:rPr>
+          <w:b w:val="0"/>
+        </w:rPr>
+        <w:t xml:space="preserve"> (листинг полностью - в приложении А). Сценарий задаёт параметры подключения к PostgreSQL (PGHOST, PGPORT, PGUSER, PGDATABASE, клиентская кодировка UTF8), передаёт параметры сценариям psql через стандартный ввод командами \set (кириллица в аргументах командной строки Windows не искажается), вызывает командные файлы .bat и приводит вывод к UTF-8 фильтром helper/fixenc.pl. Все результаты, приведённые в отчёте, получены этими командами; в подписи каждого листинга результата указана команда ./h.</w:t>
+      </w:r>
+    </w:p>
+    <w:p>
+      <w:pPr>
+        <w:ind w:firstLine="709"/>
+        <w:jc w:val="both"/>
+      </w:pPr>
+      <w:r>
+        <w:rPr>
+          <w:b w:val="0"/>
+        </w:rPr>
+        <w:t>Порядок демонстрации работы на защите:</w:t>
+      </w:r>
+    </w:p>
+    <w:p>
+      <w:pPr>
+        <w:keepNext/>
+        <w:spacing w:before="120"/>
+      </w:pPr>
+      <w:r>
+        <w:rPr>
+          <w:sz w:val="24"/>
+        </w:rPr>
+        <w:t>Таблица 3 – Команды ./h для защиты ЛР2, вариант 20</w:t>
+      </w:r>
+    </w:p>
+    <w:tbl>
+      <w:tblPr>
+        <w:tblStyle w:val="TableGrid"/>
+        <w:tblW w:type="auto" w:w="0"/>
+        <w:jc w:val="center"/>
+        <w:tblLook w:firstColumn="1" w:firstRow="1" w:lastColumn="0" w:lastRow="0" w:noHBand="0" w:noVBand="1" w:val="04A0"/>
+      </w:tblPr>
+      <w:tblGrid>
+        <w:gridCol w:w="3118"/>
+        <w:gridCol w:w="3118"/>
+        <w:gridCol w:w="3118"/>
+      </w:tblGrid>
+      <w:tr>
+        <w:tc>
+          <w:tcPr>
+            <w:tcW w:type="dxa" w:w="567"/>
+            <w:shd w:val="clear" w:color="auto" w:fill="E7E6E6"/>
+          </w:tcPr>
+          <w:p>
+            <w:r>
+              <w:rPr>
+                <w:b/>
+                <w:sz w:val="22"/>
+              </w:rPr>
+              <w:t>№</w:t>
+            </w:r>
+          </w:p>
+        </w:tc>
+        <w:tc>
+          <w:tcPr>
+            <w:tcW w:type="dxa" w:w="4252"/>
+            <w:shd w:val="clear" w:color="auto" w:fill="E7E6E6"/>
+          </w:tcPr>
+          <w:p>
+            <w:r>
+              <w:rPr>
+                <w:b/>
+                <w:sz w:val="22"/>
+              </w:rPr>
+              <w:t>Команда</w:t>
+            </w:r>
+          </w:p>
+        </w:tc>
+        <w:tc>
+          <w:tcPr>
+            <w:tcW w:type="dxa" w:w="4535"/>
+            <w:shd w:val="clear" w:color="auto" w:fill="E7E6E6"/>
+          </w:tcPr>
+          <w:p>
+            <w:r>
+              <w:rPr>
+                <w:b/>
+                <w:sz w:val="22"/>
+              </w:rPr>
+              <w:t>Что выполняется</w:t>
+            </w:r>
+          </w:p>
+        </w:tc>
+      </w:tr>
+      <w:tr>
+        <w:tc>
+          <w:tcPr>
+            <w:tcW w:type="dxa" w:w="567"/>
+          </w:tcPr>
+          <w:p>
+            <w:r>
+              <w:rPr>
+                <w:sz w:val="22"/>
+              </w:rPr>
+              <w:t>1</w:t>
+            </w:r>
+          </w:p>
+        </w:tc>
+        <w:tc>
+          <w:tcPr>
+            <w:tcW w:type="dxa" w:w="4252"/>
+          </w:tcPr>
+          <w:p>
+            <w:r>
+              <w:rPr>
+                <w:sz w:val="22"/>
+              </w:rPr>
+              <w:t>./h lr2 gen 2000000</w:t>
+            </w:r>
+          </w:p>
+        </w:tc>
+        <w:tc>
+          <w:tcPr>
+            <w:tcW w:type="dxa" w:w="4535"/>
+          </w:tcPr>
+          <w:p>
+            <w:r>
+              <w:rPr>
+                <w:sz w:val="22"/>
+              </w:rPr>
+              <w:t>lab2/add_data.sql - 2 млн записей в ПРОДАЖА</w:t>
+            </w:r>
+          </w:p>
+        </w:tc>
+      </w:tr>
+      <w:tr>
+        <w:tc>
+          <w:tcPr>
+            <w:tcW w:type="dxa" w:w="567"/>
+          </w:tcPr>
+          <w:p>
+            <w:r>
+              <w:rPr>
+                <w:sz w:val="22"/>
+              </w:rPr>
+              <w:t>2</w:t>
+            </w:r>
+          </w:p>
+        </w:tc>
+        <w:tc>
+          <w:tcPr>
+            <w:tcW w:type="dxa" w:w="4252"/>
+          </w:tcPr>
+          <w:p>
+            <w:r>
+              <w:rPr>
+                <w:sz w:val="22"/>
+              </w:rPr>
+              <w:t>./h lr2 tbs D:/PG_TBS</w:t>
+            </w:r>
+          </w:p>
+        </w:tc>
+        <w:tc>
+          <w:tcPr>
+            <w:tcW w:type="dxa" w:w="4535"/>
+          </w:tcPr>
+          <w:p>
+            <w:r>
+              <w:rPr>
+                <w:sz w:val="22"/>
+              </w:rPr>
+              <w:t>lab2/tablespace.sql - ПРОДАЖА в табличное пространство</w:t>
+            </w:r>
+          </w:p>
+        </w:tc>
+      </w:tr>
+      <w:tr>
+        <w:tc>
+          <w:tcPr>
+            <w:tcW w:type="dxa" w:w="567"/>
+          </w:tcPr>
+          <w:p>
+            <w:r>
+              <w:rPr>
+                <w:sz w:val="22"/>
+              </w:rPr>
+              <w:t>3</w:t>
+            </w:r>
+          </w:p>
+        </w:tc>
+        <w:tc>
+          <w:tcPr>
+            <w:tcW w:type="dxa" w:w="4252"/>
+          </w:tcPr>
+          <w:p>
+            <w:r>
+              <w:rPr>
+                <w:sz w:val="22"/>
+              </w:rPr>
+              <w:t>./h lr2 time 20</w:t>
+            </w:r>
+          </w:p>
+        </w:tc>
+        <w:tc>
+          <w:tcPr>
+            <w:tcW w:type="dxa" w:w="4535"/>
+          </w:tcPr>
+          <w:p>
+            <w:r>
+              <w:rPr>
+                <w:sz w:val="22"/>
+              </w:rPr>
+              <w:t>lab2/time_current.sql - 5 замеров через CURRENT_TIME</w:t>
+            </w:r>
+          </w:p>
+        </w:tc>
+      </w:tr>
+      <w:tr>
+        <w:tc>
+          <w:tcPr>
+            <w:tcW w:type="dxa" w:w="567"/>
+          </w:tcPr>
+          <w:p>
+            <w:r>
+              <w:rPr>
+                <w:sz w:val="22"/>
+              </w:rPr>
+              <w:t>4</w:t>
+            </w:r>
+          </w:p>
+        </w:tc>
+        <w:tc>
+          <w:tcPr>
+            <w:tcW w:type="dxa" w:w="4252"/>
+          </w:tcPr>
+          <w:p>
+            <w:r>
+              <w:rPr>
+                <w:sz w:val="22"/>
+              </w:rPr>
+              <w:t>./h lr2 timing 20</w:t>
+            </w:r>
+          </w:p>
+        </w:tc>
+        <w:tc>
+          <w:tcPr>
+            <w:tcW w:type="dxa" w:w="4535"/>
+          </w:tcPr>
+          <w:p>
+            <w:r>
+              <w:rPr>
+                <w:sz w:val="22"/>
+              </w:rPr>
+              <w:t>lab2/time_timing.sql - 5 замеров через \timing on</w:t>
+            </w:r>
+          </w:p>
+        </w:tc>
+      </w:tr>
+      <w:tr>
+        <w:tc>
+          <w:tcPr>
+            <w:tcW w:type="dxa" w:w="567"/>
+          </w:tcPr>
+          <w:p>
+            <w:r>
+              <w:rPr>
+                <w:sz w:val="22"/>
+              </w:rPr>
+              <w:t>5</w:t>
+            </w:r>
+          </w:p>
+        </w:tc>
+        <w:tc>
+          <w:tcPr>
+            <w:tcW w:type="dxa" w:w="4252"/>
+          </w:tcPr>
+          <w:p>
+            <w:r>
+              <w:rPr>
+                <w:sz w:val="22"/>
+              </w:rPr>
+              <w:t>./h lr2 idx 20</w:t>
+            </w:r>
+          </w:p>
+        </w:tc>
+        <w:tc>
+          <w:tcPr>
+            <w:tcW w:type="dxa" w:w="4535"/>
+          </w:tcPr>
+          <w:p>
+            <w:r>
+              <w:rPr>
+                <w:sz w:val="22"/>
+              </w:rPr>
+              <w:t>lab2/idx_names.sql - индексы ПРОДАЖА и ТОВАР</w:t>
+            </w:r>
+          </w:p>
+        </w:tc>
+      </w:tr>
+      <w:tr>
+        <w:tc>
+          <w:tcPr>
+            <w:tcW w:type="dxa" w:w="567"/>
+          </w:tcPr>
+          <w:p>
+            <w:r>
+              <w:rPr>
+                <w:sz w:val="22"/>
+              </w:rPr>
+              <w:t>6</w:t>
+            </w:r>
+          </w:p>
+        </w:tc>
+        <w:tc>
+          <w:tcPr>
+            <w:tcW w:type="dxa" w:w="4252"/>
+          </w:tcPr>
+          <w:p>
+            <w:r>
+              <w:rPr>
+                <w:sz w:val="22"/>
+              </w:rPr>
+              <w:t>./h lr2 idx1 20 btree</w:t>
+            </w:r>
+          </w:p>
+        </w:tc>
+        <w:tc>
+          <w:tcPr>
+            <w:tcW w:type="dxa" w:w="4535"/>
+          </w:tcPr>
+          <w:p>
+            <w:r>
+              <w:rPr>
+                <w:sz w:val="22"/>
+              </w:rPr>
+              <w:t>lab2/idx_1.sql - btree-индекс по полю-ссылке</w:t>
+            </w:r>
+          </w:p>
+        </w:tc>
+      </w:tr>
+      <w:tr>
+        <w:tc>
+          <w:tcPr>
+            <w:tcW w:type="dxa" w:w="567"/>
+          </w:tcPr>
+          <w:p>
+            <w:r>
+              <w:rPr>
+                <w:sz w:val="22"/>
+              </w:rPr>
+              <w:t>7</w:t>
+            </w:r>
+          </w:p>
+        </w:tc>
+        <w:tc>
+          <w:tcPr>
+            <w:tcW w:type="dxa" w:w="4252"/>
+          </w:tcPr>
+          <w:p>
+            <w:r>
+              <w:rPr>
+                <w:sz w:val="22"/>
+              </w:rPr>
+              <w:t>./h lr2 explain 20 1</w:t>
+            </w:r>
+          </w:p>
+        </w:tc>
+        <w:tc>
+          <w:tcPr>
+            <w:tcW w:type="dxa" w:w="4535"/>
+          </w:tcPr>
+          <w:p>
+            <w:r>
+              <w:rPr>
+                <w:sz w:val="22"/>
+              </w:rPr>
+              <w:t>lab2/explain.sql - EXPLAIN / EXPLAIN ANALYZE с WHERE</w:t>
+            </w:r>
+          </w:p>
+        </w:tc>
+      </w:tr>
+      <w:tr>
+        <w:tc>
+          <w:tcPr>
+            <w:tcW w:type="dxa" w:w="567"/>
+          </w:tcPr>
+          <w:p>
+            <w:r>
+              <w:rPr>
+                <w:sz w:val="22"/>
+              </w:rPr>
+              <w:t>8</w:t>
+            </w:r>
+          </w:p>
+        </w:tc>
+        <w:tc>
+          <w:tcPr>
+            <w:tcW w:type="dxa" w:w="4252"/>
+          </w:tcPr>
+          <w:p>
+            <w:r>
+              <w:rPr>
+                <w:sz w:val="22"/>
+              </w:rPr>
+              <w:t>./h lr2 idx0 20</w:t>
+            </w:r>
+          </w:p>
+        </w:tc>
+        <w:tc>
+          <w:tcPr>
+            <w:tcW w:type="dxa" w:w="4535"/>
+          </w:tcPr>
+          <w:p>
+            <w:r>
+              <w:rPr>
+                <w:sz w:val="22"/>
+              </w:rPr>
+              <w:t>lab2/idx_0.sql - удаление индекса</w:t>
+            </w:r>
+          </w:p>
+        </w:tc>
+      </w:tr>
+      <w:tr>
+        <w:tc>
+          <w:tcPr>
+            <w:tcW w:type="dxa" w:w="567"/>
+          </w:tcPr>
+          <w:p>
+            <w:r>
+              <w:rPr>
+                <w:sz w:val="22"/>
+              </w:rPr>
+              <w:t>9</w:t>
+            </w:r>
+          </w:p>
+        </w:tc>
+        <w:tc>
+          <w:tcPr>
+            <w:tcW w:type="dxa" w:w="4252"/>
+          </w:tcPr>
+          <w:p>
+            <w:r>
+              <w:rPr>
+                <w:sz w:val="22"/>
+              </w:rPr>
+              <w:t>./h lr2 idx1 20 hash</w:t>
+            </w:r>
+          </w:p>
+        </w:tc>
+        <w:tc>
+          <w:tcPr>
+            <w:tcW w:type="dxa" w:w="4535"/>
+          </w:tcPr>
+          <w:p>
+            <w:r>
+              <w:rPr>
+                <w:sz w:val="22"/>
+              </w:rPr>
+              <w:t>hash-индекс по тому же полю</w:t>
+            </w:r>
+          </w:p>
+        </w:tc>
+      </w:tr>
+      <w:tr>
+        <w:tc>
+          <w:tcPr>
+            <w:tcW w:type="dxa" w:w="567"/>
+          </w:tcPr>
+          <w:p>
+            <w:r>
+              <w:rPr>
+                <w:sz w:val="22"/>
+              </w:rPr>
+              <w:t>10</w:t>
+            </w:r>
+          </w:p>
+        </w:tc>
+        <w:tc>
+          <w:tcPr>
+            <w:tcW w:type="dxa" w:w="4252"/>
+          </w:tcPr>
+          <w:p>
+            <w:r>
+              <w:rPr>
+                <w:sz w:val="22"/>
+              </w:rPr>
+              <w:t>./h lr2 pk0 20</w:t>
+            </w:r>
+          </w:p>
+        </w:tc>
+        <w:tc>
+          <w:tcPr>
+            <w:tcW w:type="dxa" w:w="4535"/>
+          </w:tcPr>
+          <w:p>
+            <w:r>
+              <w:rPr>
+                <w:sz w:val="22"/>
+              </w:rPr>
+              <w:t>lab2/create_ref1.sql - ТОВАР без PRIMARY KEY</w:t>
+            </w:r>
+          </w:p>
+        </w:tc>
+      </w:tr>
+      <w:tr>
+        <w:tc>
+          <w:tcPr>
+            <w:tcW w:type="dxa" w:w="567"/>
+          </w:tcPr>
+          <w:p>
+            <w:r>
+              <w:rPr>
+                <w:sz w:val="22"/>
+              </w:rPr>
+              <w:t>11</w:t>
+            </w:r>
+          </w:p>
+        </w:tc>
+        <w:tc>
+          <w:tcPr>
+            <w:tcW w:type="dxa" w:w="4252"/>
+          </w:tcPr>
+          <w:p>
+            <w:r>
+              <w:rPr>
+                <w:sz w:val="22"/>
+              </w:rPr>
+              <w:t>./h lr2 pk1 20</w:t>
+            </w:r>
+          </w:p>
+        </w:tc>
+        <w:tc>
+          <w:tcPr>
+            <w:tcW w:type="dxa" w:w="4535"/>
+          </w:tcPr>
+          <w:p>
+            <w:r>
+              <w:rPr>
+                <w:sz w:val="22"/>
+              </w:rPr>
+              <w:t>lab2/create_ref0.sql - ТОВАР с PRIMARY KEY</w:t>
+            </w:r>
+          </w:p>
+        </w:tc>
+      </w:tr>
+      <w:tr>
+        <w:tc>
+          <w:tcPr>
+            <w:tcW w:type="dxa" w:w="567"/>
+          </w:tcPr>
+          <w:p>
+            <w:r>
+              <w:rPr>
+                <w:sz w:val="22"/>
+              </w:rPr>
+              <w:t>12</w:t>
+            </w:r>
+          </w:p>
+        </w:tc>
+        <w:tc>
+          <w:tcPr>
+            <w:tcW w:type="dxa" w:w="4252"/>
+          </w:tcPr>
+          <w:p>
+            <w:r>
+              <w:rPr>
+                <w:sz w:val="22"/>
+              </w:rPr>
+              <w:t>./h lr2 copy 20</w:t>
+            </w:r>
+          </w:p>
+        </w:tc>
+        <w:tc>
+          <w:tcPr>
+            <w:tcW w:type="dxa" w:w="4535"/>
+          </w:tcPr>
+          <w:p>
+            <w:r>
+              <w:rPr>
+                <w:sz w:val="22"/>
+              </w:rPr>
+              <w:t>lab2/copy_ref.sql - загрузка ТОВАР из DATA/SOURCE</w:t>
+            </w:r>
+          </w:p>
+        </w:tc>
+      </w:tr>
+      <w:tr>
+        <w:tc>
+          <w:tcPr>
+            <w:tcW w:type="dxa" w:w="567"/>
+          </w:tcPr>
+          <w:p>
+            <w:r>
+              <w:rPr>
+                <w:sz w:val="22"/>
+              </w:rPr>
+              <w:t>13</w:t>
+            </w:r>
+          </w:p>
+        </w:tc>
+        <w:tc>
+          <w:tcPr>
+            <w:tcW w:type="dxa" w:w="4252"/>
+          </w:tcPr>
+          <w:p>
+            <w:r>
+              <w:rPr>
+                <w:sz w:val="22"/>
+              </w:rPr>
+              <w:t>./h lr2 measure 20</w:t>
+            </w:r>
+          </w:p>
+        </w:tc>
+        <w:tc>
+          <w:tcPr>
+            <w:tcW w:type="dxa" w:w="4535"/>
+          </w:tcPr>
+          <w:p>
+            <w:r>
+              <w:rPr>
+                <w:sz w:val="22"/>
+              </w:rPr>
+              <w:t>lab2/measure.sql - протокол results/lr2_v20_results.txt</w:t>
+            </w:r>
+          </w:p>
+        </w:tc>
+      </w:tr>
+      <w:tr>
+        <w:tc>
+          <w:tcPr>
+            <w:tcW w:type="dxa" w:w="567"/>
+          </w:tcPr>
+          <w:p>
+            <w:r>
+              <w:rPr>
+                <w:sz w:val="22"/>
+              </w:rPr>
+              <w:t>14</w:t>
+            </w:r>
+          </w:p>
+        </w:tc>
+        <w:tc>
+          <w:tcPr>
+            <w:tcW w:type="dxa" w:w="4252"/>
+          </w:tcPr>
+          <w:p>
+            <w:r>
+              <w:rPr>
+                <w:sz w:val="22"/>
+              </w:rPr>
+              <w:t>./h lr2 results 20</w:t>
+            </w:r>
+          </w:p>
+        </w:tc>
+        <w:tc>
+          <w:tcPr>
+            <w:tcW w:type="dxa" w:w="4535"/>
+          </w:tcPr>
+          <w:p>
+            <w:r>
+              <w:rPr>
+                <w:sz w:val="22"/>
+              </w:rPr>
+              <w:t>показать протокол измерений</w:t>
+            </w:r>
+          </w:p>
+        </w:tc>
+      </w:tr>
+      <w:tr>
+        <w:tc>
+          <w:tcPr>
+            <w:tcW w:type="dxa" w:w="567"/>
+          </w:tcPr>
+          <w:p>
+            <w:r>
+              <w:rPr>
+                <w:sz w:val="22"/>
+              </w:rPr>
+              <w:t>15</w:t>
+            </w:r>
+          </w:p>
+        </w:tc>
+        <w:tc>
+          <w:tcPr>
+            <w:tcW w:type="dxa" w:w="4252"/>
+          </w:tcPr>
+          <w:p>
+            <w:r>
+              <w:rPr>
+                <w:sz w:val="22"/>
+              </w:rPr>
+              <w:t>./h lr2 restore</w:t>
+            </w:r>
+          </w:p>
+        </w:tc>
+        <w:tc>
+          <w:tcPr>
+            <w:tcW w:type="dxa" w:w="4535"/>
+          </w:tcPr>
+          <w:p>
+            <w:r>
+              <w:rPr>
+                <w:sz w:val="22"/>
+              </w:rPr>
+              <w:t>lab2/restore_lr1.sql - вернуть 1000 записей ЛР1</w:t>
+            </w:r>
+          </w:p>
+        </w:tc>
+      </w:tr>
+    </w:tbl>
+    <w:p>
+      <w:pPr>
+        <w:spacing w:after="40"/>
+      </w:pPr>
+    </w:p>
+    <w:p>
+      <w:pPr>
+        <w:ind w:firstLine="709"/>
+        <w:jc w:val="both"/>
+      </w:pPr>
+      <w:r>
+        <w:rPr>
+          <w:b w:val="0"/>
+        </w:rPr>
+        <w:t>Команды lr2 time, timing, explain и measure требуют объёмной таблицы ПРОДАЖА (./h lr2 gen); перед ЛР1, ЛР6 и ЛР7 исходные 1000 записей возвращаются командой ./h lr2 restore.</w:t>
+      </w:r>
+    </w:p>
+    <w:p>
+      <w:pPr>
+        <w:keepNext/>
+        <w:spacing w:before="120"/>
+      </w:pPr>
+      <w:r>
+        <w:rPr>
+          <w:i/>
+          <w:sz w:val="24"/>
+        </w:rPr>
+        <w:t>Листинг 26 – справка по командам ЛР2: ./h (без параметров)</w:t>
+      </w:r>
+    </w:p>
+    <w:tbl>
+      <w:tblPr>
+        <w:tblStyle w:val="TableGrid"/>
+        <w:tblW w:type="auto" w:w="0"/>
+        <w:jc w:val="center"/>
+        <w:tblLook w:firstColumn="1" w:firstRow="1" w:lastColumn="0" w:lastRow="0" w:noHBand="0" w:noVBand="1" w:val="04A0"/>
+      </w:tblPr>
+      <w:tblGrid>
+        <w:gridCol w:w="9355"/>
+      </w:tblGrid>
+      <w:tr>
+        <w:tc>
+          <w:tcPr>
+            <w:tcW w:type="dxa" w:w="9355"/>
+            <w:shd w:val="clear" w:color="auto" w:fill="F5F5F5"/>
+          </w:tcPr>
+          <w:p>
+            <w:pPr>
+              <w:spacing w:line="240" w:lineRule="auto"/>
+            </w:pPr>
+            <w:r/>
+            <w:r>
+              <w:rPr>
+                <w:rFonts w:ascii="Courier New" w:hAnsi="Courier New" w:eastAsia="Courier New"/>
+                <w:sz w:val="16"/>
+              </w:rPr>
+              <w:t>================== ЛР2: ОБЪЁМНАЯ БД, ИНДЕКСЫ, EXPLAIN ==================</w:t>
+            </w:r>
+          </w:p>
+          <w:p>
+            <w:pPr>
+              <w:spacing w:line="240" w:lineRule="auto"/>
+            </w:pPr>
+            <w:r>
+              <w:rPr>
+                <w:rFonts w:ascii="Courier New" w:hAnsi="Courier New" w:eastAsia="Courier New"/>
+                <w:sz w:val="16"/>
+              </w:rPr>
+              <w:t xml:space="preserve">  ./h lr2 gen [N]           - ПРОДАЖА: N псевдослучайных записей (по умолч. 2 000 000)</w:t>
+            </w:r>
+          </w:p>
+          <w:p>
+            <w:pPr>
+              <w:spacing w:line="240" w:lineRule="auto"/>
+            </w:pPr>
+            <w:r>
+              <w:rPr>
+                <w:rFonts w:ascii="Courier New" w:hAnsi="Courier New" w:eastAsia="Courier New"/>
+                <w:sz w:val="16"/>
+              </w:rPr>
+              <w:t xml:space="preserve">  ./h lr2 restore           - вернуть 1000 записей ПРОДАЖА из ЛР1</w:t>
+            </w:r>
+          </w:p>
+          <w:p>
+            <w:pPr>
+              <w:spacing w:line="240" w:lineRule="auto"/>
+            </w:pPr>
+            <w:r>
+              <w:rPr>
+                <w:rFonts w:ascii="Courier New" w:hAnsi="Courier New" w:eastAsia="Courier New"/>
+                <w:sz w:val="16"/>
+              </w:rPr>
+              <w:t xml:space="preserve">  ./h lr2 tbs [каталог]     - вынести ПРОДАЖА в табличное пространство (D:/PG_TBS)</w:t>
+            </w:r>
+          </w:p>
+          <w:p>
+            <w:pPr>
+              <w:spacing w:line="240" w:lineRule="auto"/>
+            </w:pPr>
+            <w:r>
+              <w:rPr>
+                <w:rFonts w:ascii="Courier New" w:hAnsi="Courier New" w:eastAsia="Courier New"/>
+                <w:sz w:val="16"/>
+              </w:rPr>
+              <w:t xml:space="preserve">  ./h lr2 time 20|22        - время запроса (*) по CURRENT_TIME, 5 замеров</w:t>
+            </w:r>
+          </w:p>
+          <w:p>
+            <w:pPr>
+              <w:spacing w:line="240" w:lineRule="auto"/>
+            </w:pPr>
+            <w:r>
+              <w:rPr>
+                <w:rFonts w:ascii="Courier New" w:hAnsi="Courier New" w:eastAsia="Courier New"/>
+                <w:sz w:val="16"/>
+              </w:rPr>
+              <w:t xml:space="preserve">  ./h lr2 timing 20|22      - время запроса (*) по \timing on, 5 замеров</w:t>
+            </w:r>
+          </w:p>
+          <w:p>
+            <w:pPr>
+              <w:spacing w:line="240" w:lineRule="auto"/>
+            </w:pPr>
+            <w:r>
+              <w:rPr>
+                <w:rFonts w:ascii="Courier New" w:hAnsi="Courier New" w:eastAsia="Courier New"/>
+                <w:sz w:val="16"/>
+              </w:rPr>
+              <w:t xml:space="preserve">  ./h lr2 idx 20|22         - индексы ПРОДАЖА и таблицы-справочника</w:t>
+            </w:r>
+          </w:p>
+          <w:p>
+            <w:pPr>
+              <w:spacing w:line="240" w:lineRule="auto"/>
+            </w:pPr>
+            <w:r>
+              <w:rPr>
+                <w:rFonts w:ascii="Courier New" w:hAnsi="Courier New" w:eastAsia="Courier New"/>
+                <w:sz w:val="16"/>
+              </w:rPr>
+              <w:t xml:space="preserve">  ./h lr2 idx1 20|22 [btree|hash] - создать индекс ПРОДАЖА по полю-ссылке</w:t>
+            </w:r>
+          </w:p>
+          <w:p>
+            <w:pPr>
+              <w:spacing w:line="240" w:lineRule="auto"/>
+            </w:pPr>
+            <w:r>
+              <w:rPr>
+                <w:rFonts w:ascii="Courier New" w:hAnsi="Courier New" w:eastAsia="Courier New"/>
+                <w:sz w:val="16"/>
+              </w:rPr>
+              <w:t xml:space="preserve">  ./h lr2 idx0 20|22        - удалить индекс ПРОДАЖА по полю-ссылке</w:t>
+            </w:r>
+          </w:p>
+          <w:p>
+            <w:pPr>
+              <w:spacing w:line="240" w:lineRule="auto"/>
+            </w:pPr>
+            <w:r>
+              <w:rPr>
+                <w:rFonts w:ascii="Courier New" w:hAnsi="Courier New" w:eastAsia="Courier New"/>
+                <w:sz w:val="16"/>
+              </w:rPr>
+              <w:t xml:space="preserve">  ./h lr2 pk1 20|22         - справочник с PRIMARY KEY (create_ref0)</w:t>
+            </w:r>
+          </w:p>
+          <w:p>
+            <w:pPr>
+              <w:spacing w:line="240" w:lineRule="auto"/>
+            </w:pPr>
+            <w:r>
+              <w:rPr>
+                <w:rFonts w:ascii="Courier New" w:hAnsi="Courier New" w:eastAsia="Courier New"/>
+                <w:sz w:val="16"/>
+              </w:rPr>
+              <w:t xml:space="preserve">  ./h lr2 pk0 20|22         - справочник без PRIMARY KEY (create_ref1)</w:t>
+            </w:r>
+          </w:p>
+          <w:p>
+            <w:pPr>
+              <w:spacing w:line="240" w:lineRule="auto"/>
+            </w:pPr>
+            <w:r>
+              <w:rPr>
+                <w:rFonts w:ascii="Courier New" w:hAnsi="Courier New" w:eastAsia="Courier New"/>
+                <w:sz w:val="16"/>
+              </w:rPr>
+              <w:t xml:space="preserve">  ./h lr2 copy 20|22        - перезагрузить справочник из DATA/SOURCE</w:t>
+            </w:r>
+          </w:p>
+          <w:p>
+            <w:pPr>
+              <w:spacing w:line="240" w:lineRule="auto"/>
+            </w:pPr>
+            <w:r>
+              <w:rPr>
+                <w:rFonts w:ascii="Courier New" w:hAnsi="Courier New" w:eastAsia="Courier New"/>
+                <w:sz w:val="16"/>
+              </w:rPr>
+              <w:t xml:space="preserve">  ./h lr2 explain 20|22 [1] - EXPLAIN / EXPLAIN ANALYZE (1 - с WHERE)</w:t>
+            </w:r>
+          </w:p>
+          <w:p>
+            <w:pPr>
+              <w:spacing w:line="240" w:lineRule="auto"/>
+            </w:pPr>
+            <w:r>
+              <w:rPr>
+                <w:rFonts w:ascii="Courier New" w:hAnsi="Courier New" w:eastAsia="Courier New"/>
+                <w:sz w:val="16"/>
+              </w:rPr>
+              <w:t xml:space="preserve">  ./h lr2 measure 20|22 [прогонов] - протокол замеров -&gt; results/lr2_vNN_results.txt</w:t>
+            </w:r>
+          </w:p>
+          <w:p>
+            <w:pPr>
+              <w:spacing w:line="240" w:lineRule="auto"/>
+            </w:pPr>
+            <w:r>
+              <w:rPr>
+                <w:rFonts w:ascii="Courier New" w:hAnsi="Courier New" w:eastAsia="Courier New"/>
+                <w:sz w:val="16"/>
+              </w:rPr>
+              <w:t xml:space="preserve">  ./h lr2 results 20|22     - показать протокол замеров</w:t>
+            </w:r>
+          </w:p>
+        </w:tc>
+      </w:tr>
+    </w:tbl>
+    <w:p>
+      <w:pPr>
+        <w:spacing w:after="40"/>
+      </w:pPr>
+    </w:p>
+    <w:p>
+      <w:pPr>
+        <w:keepNext/>
+        <w:spacing w:before="120"/>
+      </w:pPr>
+      <w:r>
+        <w:rPr>
+          <w:i/>
+          <w:sz w:val="24"/>
+        </w:rPr>
+        <w:t>Листинг 27 – обработка команд ЛР2 в сценарии h (фрагмент)</w:t>
+      </w:r>
+    </w:p>
+    <w:tbl>
+      <w:tblPr>
+        <w:tblStyle w:val="TableGrid"/>
+        <w:tblW w:type="auto" w:w="0"/>
+        <w:jc w:val="center"/>
+        <w:tblLook w:firstColumn="1" w:firstRow="1" w:lastColumn="0" w:lastRow="0" w:noHBand="0" w:noVBand="1" w:val="04A0"/>
+      </w:tblPr>
+      <w:tblGrid>
+        <w:gridCol w:w="9355"/>
+      </w:tblGrid>
+      <w:tr>
+        <w:tc>
+          <w:tcPr>
+            <w:tcW w:type="dxa" w:w="9355"/>
+            <w:shd w:val="clear" w:color="auto" w:fill="F5F5F5"/>
+          </w:tcPr>
+          <w:p>
+            <w:pPr>
+              <w:spacing w:line="240" w:lineRule="auto"/>
+            </w:pPr>
+            <w:r/>
+            <w:r>
+              <w:rPr>
+                <w:rFonts w:ascii="Courier New" w:hAnsi="Courier New" w:eastAsia="Courier New"/>
+                <w:sz w:val="16"/>
+              </w:rPr>
+              <w:t xml:space="preserve">    # ------------------------------ ЛР2 ------------------------------</w:t>
+            </w:r>
+          </w:p>
+          <w:p>
+            <w:pPr>
+              <w:spacing w:line="240" w:lineRule="auto"/>
+            </w:pPr>
+            <w:r>
+              <w:rPr>
+                <w:rFonts w:ascii="Courier New" w:hAnsi="Courier New" w:eastAsia="Courier New"/>
+                <w:sz w:val="16"/>
+              </w:rPr>
+              <w:t xml:space="preserve">    lr2)</w:t>
+            </w:r>
+          </w:p>
+          <w:p>
+            <w:pPr>
+              <w:spacing w:line="240" w:lineRule="auto"/>
+            </w:pPr>
+            <w:r>
+              <w:rPr>
+                <w:rFonts w:ascii="Courier New" w:hAnsi="Courier New" w:eastAsia="Courier New"/>
+                <w:sz w:val="16"/>
+              </w:rPr>
+              <w:t xml:space="preserve">        case "$2" in</w:t>
+            </w:r>
+          </w:p>
+          <w:p>
+            <w:pPr>
+              <w:spacing w:line="240" w:lineRule="auto"/>
+            </w:pPr>
+            <w:r>
+              <w:rPr>
+                <w:rFonts w:ascii="Courier New" w:hAnsi="Courier New" w:eastAsia="Courier New"/>
+                <w:sz w:val="16"/>
+              </w:rPr>
+              <w:t xml:space="preserve">            gen)      run lab2/add_data.sql "$3" ;;</w:t>
+            </w:r>
+          </w:p>
+          <w:p>
+            <w:pPr>
+              <w:spacing w:line="240" w:lineRule="auto"/>
+            </w:pPr>
+            <w:r>
+              <w:rPr>
+                <w:rFonts w:ascii="Courier New" w:hAnsi="Courier New" w:eastAsia="Courier New"/>
+                <w:sz w:val="16"/>
+              </w:rPr>
+              <w:t xml:space="preserve">            restore)  run lab2/restore_lr1.sql ;;</w:t>
+            </w:r>
+          </w:p>
+          <w:p>
+            <w:pPr>
+              <w:spacing w:line="240" w:lineRule="auto"/>
+            </w:pPr>
+            <w:r>
+              <w:rPr>
+                <w:rFonts w:ascii="Courier New" w:hAnsi="Courier New" w:eastAsia="Courier New"/>
+                <w:sz w:val="16"/>
+              </w:rPr>
+              <w:t xml:space="preserve">            tbs)      run lab2/tablespace.sql "$3" ;;</w:t>
+            </w:r>
+          </w:p>
+          <w:p>
+            <w:pPr>
+              <w:spacing w:line="240" w:lineRule="auto"/>
+            </w:pPr>
+            <w:r>
+              <w:rPr>
+                <w:rFonts w:ascii="Courier New" w:hAnsi="Courier New" w:eastAsia="Courier New"/>
+                <w:sz w:val="16"/>
+              </w:rPr>
+              <w:t xml:space="preserve">            time)     need_variant "$3"; run lab2/time_current.sql "$3" ;;</w:t>
+            </w:r>
+          </w:p>
+          <w:p>
+            <w:pPr>
+              <w:spacing w:line="240" w:lineRule="auto"/>
+            </w:pPr>
+            <w:r>
+              <w:rPr>
+                <w:rFonts w:ascii="Courier New" w:hAnsi="Courier New" w:eastAsia="Courier New"/>
+                <w:sz w:val="16"/>
+              </w:rPr>
+              <w:t xml:space="preserve">            timing)   need_variant "$3"; run lab2/time_timing.sql "$3" ;;</w:t>
+            </w:r>
+          </w:p>
+          <w:p>
+            <w:pPr>
+              <w:spacing w:line="240" w:lineRule="auto"/>
+            </w:pPr>
+            <w:r>
+              <w:rPr>
+                <w:rFonts w:ascii="Courier New" w:hAnsi="Courier New" w:eastAsia="Courier New"/>
+                <w:sz w:val="16"/>
+              </w:rPr>
+              <w:t xml:space="preserve">            idx)      need_variant "$3"; run lab2/idx_names.sql "$3" ;;</w:t>
+            </w:r>
+          </w:p>
+          <w:p>
+            <w:pPr>
+              <w:spacing w:line="240" w:lineRule="auto"/>
+            </w:pPr>
+            <w:r>
+              <w:rPr>
+                <w:rFonts w:ascii="Courier New" w:hAnsi="Courier New" w:eastAsia="Courier New"/>
+                <w:sz w:val="16"/>
+              </w:rPr>
+              <w:t xml:space="preserve">            idx1)     need_variant "$3"; run lab2/idx_1.sql "$3" "$4" ;;</w:t>
+            </w:r>
+          </w:p>
+          <w:p>
+            <w:pPr>
+              <w:spacing w:line="240" w:lineRule="auto"/>
+            </w:pPr>
+            <w:r>
+              <w:rPr>
+                <w:rFonts w:ascii="Courier New" w:hAnsi="Courier New" w:eastAsia="Courier New"/>
+                <w:sz w:val="16"/>
+              </w:rPr>
+              <w:t xml:space="preserve">            idx0)     need_variant "$3"; run lab2/idx_0.sql "$3" ;;</w:t>
+            </w:r>
+          </w:p>
+          <w:p>
+            <w:pPr>
+              <w:spacing w:line="240" w:lineRule="auto"/>
+            </w:pPr>
+            <w:r>
+              <w:rPr>
+                <w:rFonts w:ascii="Courier New" w:hAnsi="Courier New" w:eastAsia="Courier New"/>
+                <w:sz w:val="16"/>
+              </w:rPr>
+              <w:t xml:space="preserve">            pk1)      need_variant "$3"; run lab2/create_ref0.sql "$3" ;;</w:t>
+            </w:r>
+          </w:p>
+          <w:p>
+            <w:pPr>
+              <w:spacing w:line="240" w:lineRule="auto"/>
+            </w:pPr>
+            <w:r>
+              <w:rPr>
+                <w:rFonts w:ascii="Courier New" w:hAnsi="Courier New" w:eastAsia="Courier New"/>
+                <w:sz w:val="16"/>
+              </w:rPr>
+              <w:t xml:space="preserve">            pk0)      need_variant "$3"; run lab2/create_ref1.sql "$3" ;;</w:t>
+            </w:r>
+          </w:p>
+          <w:p>
+            <w:pPr>
+              <w:spacing w:line="240" w:lineRule="auto"/>
+            </w:pPr>
+            <w:r>
+              <w:rPr>
+                <w:rFonts w:ascii="Courier New" w:hAnsi="Courier New" w:eastAsia="Courier New"/>
+                <w:sz w:val="16"/>
+              </w:rPr>
+              <w:t xml:space="preserve">            copy)     need_variant "$3"; run lab2/copy_ref.sql "$3" ;;</w:t>
+            </w:r>
+          </w:p>
+          <w:p>
+            <w:pPr>
+              <w:spacing w:line="240" w:lineRule="auto"/>
+            </w:pPr>
+            <w:r>
+              <w:rPr>
+                <w:rFonts w:ascii="Courier New" w:hAnsi="Courier New" w:eastAsia="Courier New"/>
+                <w:sz w:val="16"/>
+              </w:rPr>
+              <w:t xml:space="preserve">            explain)  need_variant "$3"; run lab2/explain.sql "$3" "$4" ;;</w:t>
+            </w:r>
+          </w:p>
+          <w:p>
+            <w:pPr>
+              <w:spacing w:line="240" w:lineRule="auto"/>
+            </w:pPr>
+            <w:r>
+              <w:rPr>
+                <w:rFonts w:ascii="Courier New" w:hAnsi="Courier New" w:eastAsia="Courier New"/>
+                <w:sz w:val="16"/>
+              </w:rPr>
+              <w:t xml:space="preserve">            measure)  need_variant "$3"; run lab2/measure.sql "$3" "$4"</w:t>
+            </w:r>
+          </w:p>
+          <w:p>
+            <w:pPr>
+              <w:spacing w:line="240" w:lineRule="auto"/>
+            </w:pPr>
+            <w:r>
+              <w:rPr>
+                <w:rFonts w:ascii="Courier New" w:hAnsi="Courier New" w:eastAsia="Courier New"/>
+                <w:sz w:val="16"/>
+              </w:rPr>
+              <w:t xml:space="preserve">                      cat "results/lr2_v$3_results.txt" ;;</w:t>
+            </w:r>
+          </w:p>
+          <w:p>
+            <w:pPr>
+              <w:spacing w:line="240" w:lineRule="auto"/>
+            </w:pPr>
+            <w:r>
+              <w:rPr>
+                <w:rFonts w:ascii="Courier New" w:hAnsi="Courier New" w:eastAsia="Courier New"/>
+                <w:sz w:val="16"/>
+              </w:rPr>
+              <w:t xml:space="preserve">            results)  need_variant "$3"; cat "results/lr2_v$3_results.txt" ;;</w:t>
+            </w:r>
+          </w:p>
+          <w:p>
+            <w:pPr>
+              <w:spacing w:line="240" w:lineRule="auto"/>
+            </w:pPr>
+            <w:r>
+              <w:rPr>
+                <w:rFonts w:ascii="Courier New" w:hAnsi="Courier New" w:eastAsia="Courier New"/>
+                <w:sz w:val="16"/>
+              </w:rPr>
+              <w:t xml:space="preserve">            *) echo "ОШИБКА: ./h lr2 gen|restore|tbs|time|timing|idx|idx1|idx0|pk1|pk0|copy|explain|measure|results" ;;</w:t>
+            </w:r>
+          </w:p>
+          <w:p>
+            <w:pPr>
+              <w:spacing w:line="240" w:lineRule="auto"/>
+            </w:pPr>
+            <w:r>
+              <w:rPr>
+                <w:rFonts w:ascii="Courier New" w:hAnsi="Courier New" w:eastAsia="Courier New"/>
+                <w:sz w:val="16"/>
+              </w:rPr>
+              <w:t xml:space="preserve">        esac</w:t>
+            </w:r>
+          </w:p>
+          <w:p>
+            <w:pPr>
+              <w:spacing w:line="240" w:lineRule="auto"/>
+            </w:pPr>
+            <w:r>
+              <w:rPr>
+                <w:rFonts w:ascii="Courier New" w:hAnsi="Courier New" w:eastAsia="Courier New"/>
+                <w:sz w:val="16"/>
+              </w:rPr>
+              <w:t xml:space="preserve">        ;;</w:t>
+            </w:r>
+          </w:p>
+        </w:tc>
+      </w:tr>
+    </w:tbl>
+    <w:p>
+      <w:pPr>
+        <w:spacing w:after="40"/>
+      </w:pPr>
+    </w:p>
+    <w:p>
+      <w:pPr>
+        <w:pStyle w:val="Heading1"/>
+      </w:pPr>
+      <w:r>
+        <w:t>6. Выводы</w:t>
       </w:r>
     </w:p>
     <w:p>
@@ -9341,6 +10597,3369 @@
         </w:rPr>
         <w:t>Таблица ПРОДАЖА увеличена до 2 млн записей, время запроса (*) варианта 20 составило около 5.2 с. Измерения через CURRENT_TIME и \timing on дают близкие результаты. Освоены просмотр, создание и удаление индексов btree и hash, организация и удаление ключевых полей справочника, анализ планов запросов командами EXPLAIN и EXPLAIN ANALYZE. Индексы по полю-ссылке ускоряют запрос только при избирательном условии на поле справочника; hash-индекс по полю с малым числом значений строится очень долго и не даёт выигрыша.</w:t>
       </w:r>
+    </w:p>
+    <w:p>
+      <w:r>
+        <w:br w:type="page"/>
+      </w:r>
+    </w:p>
+    <w:p>
+      <w:pPr>
+        <w:pStyle w:val="Heading1"/>
+      </w:pPr>
+      <w:r>
+        <w:t>Приложение А. Листинг сценария h</w:t>
+      </w:r>
+    </w:p>
+    <w:p>
+      <w:pPr>
+        <w:ind w:firstLine="709"/>
+        <w:jc w:val="both"/>
+      </w:pPr>
+      <w:r>
+        <w:rPr>
+          <w:b w:val="0"/>
+        </w:rPr>
+        <w:t>Сценарий h - единая точка запуска всех лабораторных работ из Git Bash: ./h &lt;команда&gt; [параметры]; ./h без параметров выводит список команд.</w:t>
+      </w:r>
+    </w:p>
+    <w:p>
+      <w:pPr>
+        <w:keepNext/>
+        <w:spacing w:before="120"/>
+      </w:pPr>
+      <w:r>
+        <w:rPr>
+          <w:i/>
+          <w:sz w:val="24"/>
+        </w:rPr>
+        <w:t>Листинг 28 – сценарий h</w:t>
+      </w:r>
+    </w:p>
+    <w:tbl>
+      <w:tblPr>
+        <w:tblStyle w:val="TableGrid"/>
+        <w:tblW w:type="auto" w:w="0"/>
+        <w:jc w:val="center"/>
+        <w:tblLook w:firstColumn="1" w:firstRow="1" w:lastColumn="0" w:lastRow="0" w:noHBand="0" w:noVBand="1" w:val="04A0"/>
+      </w:tblPr>
+      <w:tblGrid>
+        <w:gridCol w:w="9355"/>
+      </w:tblGrid>
+      <w:tr>
+        <w:tc>
+          <w:tcPr>
+            <w:tcW w:type="dxa" w:w="9355"/>
+            <w:shd w:val="clear" w:color="auto" w:fill="F5F5F5"/>
+          </w:tcPr>
+          <w:p>
+            <w:pPr>
+              <w:spacing w:line="240" w:lineRule="auto"/>
+            </w:pPr>
+            <w:r/>
+            <w:r>
+              <w:rPr>
+                <w:rFonts w:ascii="Courier New" w:hAnsi="Courier New" w:eastAsia="Courier New"/>
+                <w:sz w:val="15"/>
+              </w:rPr>
+              <w:t>#!/bin/bash</w:t>
+            </w:r>
+          </w:p>
+          <w:p>
+            <w:pPr>
+              <w:spacing w:line="240" w:lineRule="auto"/>
+            </w:pPr>
+            <w:r>
+              <w:rPr>
+                <w:rFonts w:ascii="Courier New" w:hAnsi="Courier New" w:eastAsia="Courier New"/>
+                <w:sz w:val="15"/>
+              </w:rPr>
+              <w:t># =====================================================================</w:t>
+            </w:r>
+          </w:p>
+          <w:p>
+            <w:pPr>
+              <w:spacing w:line="240" w:lineRule="auto"/>
+            </w:pPr>
+            <w:r>
+              <w:rPr>
+                <w:rFonts w:ascii="Courier New" w:hAnsi="Courier New" w:eastAsia="Courier New"/>
+                <w:sz w:val="15"/>
+              </w:rPr>
+              <w:t>#  h - запуск задач и лабораторных работ ПАБД (база SALES), варианты 20 и 22</w:t>
+            </w:r>
+          </w:p>
+          <w:p>
+            <w:pPr>
+              <w:spacing w:line="240" w:lineRule="auto"/>
+            </w:pPr>
+            <w:r>
+              <w:rPr>
+                <w:rFonts w:ascii="Courier New" w:hAnsi="Courier New" w:eastAsia="Courier New"/>
+                <w:sz w:val="15"/>
+              </w:rPr>
+              <w:t>#  Работает в Git Bash под Windows из корня проекта: ./h &lt;команда&gt; [параметры]</w:t>
+            </w:r>
+          </w:p>
+          <w:p>
+            <w:pPr>
+              <w:spacing w:line="240" w:lineRule="auto"/>
+            </w:pPr>
+            <w:r>
+              <w:rPr>
+                <w:rFonts w:ascii="Courier New" w:hAnsi="Courier New" w:eastAsia="Courier New"/>
+                <w:sz w:val="15"/>
+              </w:rPr>
+              <w:t>#  PostgreSQL - через psql, MS SQL Server (ЛР6, ЛР7) и сборка на C (ЛР5) - через .bat</w:t>
+            </w:r>
+          </w:p>
+          <w:p>
+            <w:pPr>
+              <w:spacing w:line="240" w:lineRule="auto"/>
+            </w:pPr>
+            <w:r>
+              <w:rPr>
+                <w:rFonts w:ascii="Courier New" w:hAnsi="Courier New" w:eastAsia="Courier New"/>
+                <w:sz w:val="15"/>
+              </w:rPr>
+              <w:t># =====================================================================</w:t>
+            </w:r>
+          </w:p>
+          <w:p>
+            <w:pPr>
+              <w:spacing w:line="240" w:lineRule="auto"/>
+            </w:pPr>
+            <w:r>
+              <w:rPr>
+                <w:rFonts w:ascii="Courier New" w:hAnsi="Courier New" w:eastAsia="Courier New"/>
+                <w:sz w:val="15"/>
+              </w:rPr>
+              <w:t>cd "$(dirname "$0")" || exit 1</w:t>
+            </w:r>
+          </w:p>
+          <w:p>
+            <w:pPr>
+              <w:spacing w:line="240" w:lineRule="auto"/>
+            </w:pPr>
+            <w:r>
+              <w:rPr>
+                <w:rFonts w:ascii="Courier New" w:hAnsi="Courier New" w:eastAsia="Courier New"/>
+                <w:sz w:val="15"/>
+              </w:rPr>
+              <w:t xml:space="preserve"> </w:t>
+            </w:r>
+          </w:p>
+          <w:p>
+            <w:pPr>
+              <w:spacing w:line="240" w:lineRule="auto"/>
+            </w:pPr>
+            <w:r>
+              <w:rPr>
+                <w:rFonts w:ascii="Courier New" w:hAnsi="Courier New" w:eastAsia="Courier New"/>
+                <w:sz w:val="15"/>
+              </w:rPr>
+              <w:t>export PGHOST=${PGHOST:-localhost}</w:t>
+            </w:r>
+          </w:p>
+          <w:p>
+            <w:pPr>
+              <w:spacing w:line="240" w:lineRule="auto"/>
+            </w:pPr>
+            <w:r>
+              <w:rPr>
+                <w:rFonts w:ascii="Courier New" w:hAnsi="Courier New" w:eastAsia="Courier New"/>
+                <w:sz w:val="15"/>
+              </w:rPr>
+              <w:t>export PGPORT=${PGPORT:-5432}</w:t>
+            </w:r>
+          </w:p>
+          <w:p>
+            <w:pPr>
+              <w:spacing w:line="240" w:lineRule="auto"/>
+            </w:pPr>
+            <w:r>
+              <w:rPr>
+                <w:rFonts w:ascii="Courier New" w:hAnsi="Courier New" w:eastAsia="Courier New"/>
+                <w:sz w:val="15"/>
+              </w:rPr>
+              <w:t>export PGUSER=${PGUSER:-postgres}</w:t>
+            </w:r>
+          </w:p>
+          <w:p>
+            <w:pPr>
+              <w:spacing w:line="240" w:lineRule="auto"/>
+            </w:pPr>
+            <w:r>
+              <w:rPr>
+                <w:rFonts w:ascii="Courier New" w:hAnsi="Courier New" w:eastAsia="Courier New"/>
+                <w:sz w:val="15"/>
+              </w:rPr>
+              <w:t>export PGDATABASE=${PGDATABASE:-sales}</w:t>
+            </w:r>
+          </w:p>
+          <w:p>
+            <w:pPr>
+              <w:spacing w:line="240" w:lineRule="auto"/>
+            </w:pPr>
+            <w:r>
+              <w:rPr>
+                <w:rFonts w:ascii="Courier New" w:hAnsi="Courier New" w:eastAsia="Courier New"/>
+                <w:sz w:val="15"/>
+              </w:rPr>
+              <w:t>export PGCLIENTENCODING=UTF8</w:t>
+            </w:r>
+          </w:p>
+          <w:p>
+            <w:pPr>
+              <w:spacing w:line="240" w:lineRule="auto"/>
+            </w:pPr>
+            <w:r>
+              <w:rPr>
+                <w:rFonts w:ascii="Courier New" w:hAnsi="Courier New" w:eastAsia="Courier New"/>
+                <w:sz w:val="15"/>
+              </w:rPr>
+              <w:t>export MSYS_NO_PATHCONV=1</w:t>
+            </w:r>
+          </w:p>
+          <w:p>
+            <w:pPr>
+              <w:spacing w:line="240" w:lineRule="auto"/>
+            </w:pPr>
+            <w:r>
+              <w:rPr>
+                <w:rFonts w:ascii="Courier New" w:hAnsi="Courier New" w:eastAsia="Courier New"/>
+                <w:sz w:val="15"/>
+              </w:rPr>
+              <w:t xml:space="preserve"> </w:t>
+            </w:r>
+          </w:p>
+          <w:p>
+            <w:pPr>
+              <w:spacing w:line="240" w:lineRule="auto"/>
+            </w:pPr>
+            <w:r>
+              <w:rPr>
+                <w:rFonts w:ascii="Courier New" w:hAnsi="Courier New" w:eastAsia="Courier New"/>
+                <w:sz w:val="15"/>
+              </w:rPr>
+              <w:t># psql-сценарий с параметрами arg1..arg3 (как s.bat): параметры передаются через stdin</w:t>
+            </w:r>
+          </w:p>
+          <w:p>
+            <w:pPr>
+              <w:spacing w:line="240" w:lineRule="auto"/>
+            </w:pPr>
+            <w:r>
+              <w:rPr>
+                <w:rFonts w:ascii="Courier New" w:hAnsi="Courier New" w:eastAsia="Courier New"/>
+                <w:sz w:val="15"/>
+              </w:rPr>
+              <w:t># командами \set, т.к. psql под Windows получает argv в CP1251 и кириллица в -v ломается.</w:t>
+            </w:r>
+          </w:p>
+          <w:p>
+            <w:pPr>
+              <w:spacing w:line="240" w:lineRule="auto"/>
+            </w:pPr>
+            <w:r>
+              <w:rPr>
+                <w:rFonts w:ascii="Courier New" w:hAnsi="Courier New" w:eastAsia="Courier New"/>
+                <w:sz w:val="15"/>
+              </w:rPr>
+              <w:t># Вывод проходит через helper/fixenc.pl (служебные сообщения psql приходят в CP1251).</w:t>
+            </w:r>
+          </w:p>
+          <w:p>
+            <w:pPr>
+              <w:spacing w:line="240" w:lineRule="auto"/>
+            </w:pPr>
+            <w:r>
+              <w:rPr>
+                <w:rFonts w:ascii="Courier New" w:hAnsi="Courier New" w:eastAsia="Courier New"/>
+                <w:sz w:val="15"/>
+              </w:rPr>
+              <w:t>run() {</w:t>
+            </w:r>
+          </w:p>
+          <w:p>
+            <w:pPr>
+              <w:spacing w:line="240" w:lineRule="auto"/>
+            </w:pPr>
+            <w:r>
+              <w:rPr>
+                <w:rFonts w:ascii="Courier New" w:hAnsi="Courier New" w:eastAsia="Courier New"/>
+                <w:sz w:val="15"/>
+              </w:rPr>
+              <w:t xml:space="preserve">    local file="$1"; shift</w:t>
+            </w:r>
+          </w:p>
+          <w:p>
+            <w:pPr>
+              <w:spacing w:line="240" w:lineRule="auto"/>
+            </w:pPr>
+            <w:r>
+              <w:rPr>
+                <w:rFonts w:ascii="Courier New" w:hAnsi="Courier New" w:eastAsia="Courier New"/>
+                <w:sz w:val="15"/>
+              </w:rPr>
+              <w:t xml:space="preserve">    if [ ! -f "$file" ]; then</w:t>
+            </w:r>
+          </w:p>
+          <w:p>
+            <w:pPr>
+              <w:spacing w:line="240" w:lineRule="auto"/>
+            </w:pPr>
+            <w:r>
+              <w:rPr>
+                <w:rFonts w:ascii="Courier New" w:hAnsi="Courier New" w:eastAsia="Courier New"/>
+                <w:sz w:val="15"/>
+              </w:rPr>
+              <w:t xml:space="preserve">        echo "ОШИБКА: Файл $file не найден"</w:t>
+            </w:r>
+          </w:p>
+          <w:p>
+            <w:pPr>
+              <w:spacing w:line="240" w:lineRule="auto"/>
+            </w:pPr>
+            <w:r>
+              <w:rPr>
+                <w:rFonts w:ascii="Courier New" w:hAnsi="Courier New" w:eastAsia="Courier New"/>
+                <w:sz w:val="15"/>
+              </w:rPr>
+              <w:t xml:space="preserve">        exit 1</w:t>
+            </w:r>
+          </w:p>
+          <w:p>
+            <w:pPr>
+              <w:spacing w:line="240" w:lineRule="auto"/>
+            </w:pPr>
+            <w:r>
+              <w:rPr>
+                <w:rFonts w:ascii="Courier New" w:hAnsi="Courier New" w:eastAsia="Courier New"/>
+                <w:sz w:val="15"/>
+              </w:rPr>
+              <w:t xml:space="preserve">    fi</w:t>
+            </w:r>
+          </w:p>
+          <w:p>
+            <w:pPr>
+              <w:spacing w:line="240" w:lineRule="auto"/>
+            </w:pPr>
+            <w:r>
+              <w:rPr>
+                <w:rFonts w:ascii="Courier New" w:hAnsi="Courier New" w:eastAsia="Courier New"/>
+                <w:sz w:val="15"/>
+              </w:rPr>
+              <w:t xml:space="preserve">    {</w:t>
+            </w:r>
+          </w:p>
+          <w:p>
+            <w:pPr>
+              <w:spacing w:line="240" w:lineRule="auto"/>
+            </w:pPr>
+            <w:r>
+              <w:rPr>
+                <w:rFonts w:ascii="Courier New" w:hAnsi="Courier New" w:eastAsia="Courier New"/>
+                <w:sz w:val="15"/>
+              </w:rPr>
+              <w:t xml:space="preserve">        local i=1</w:t>
+            </w:r>
+          </w:p>
+          <w:p>
+            <w:pPr>
+              <w:spacing w:line="240" w:lineRule="auto"/>
+            </w:pPr>
+            <w:r>
+              <w:rPr>
+                <w:rFonts w:ascii="Courier New" w:hAnsi="Courier New" w:eastAsia="Courier New"/>
+                <w:sz w:val="15"/>
+              </w:rPr>
+              <w:t xml:space="preserve">        for a in "$1" "$2" "$3"; do</w:t>
+            </w:r>
+          </w:p>
+          <w:p>
+            <w:pPr>
+              <w:spacing w:line="240" w:lineRule="auto"/>
+            </w:pPr>
+            <w:r>
+              <w:rPr>
+                <w:rFonts w:ascii="Courier New" w:hAnsi="Courier New" w:eastAsia="Courier New"/>
+                <w:sz w:val="15"/>
+              </w:rPr>
+              <w:t xml:space="preserve">            printf "\\\\set arg%d '%s'\n" "$i" "${a//\'/\'\'}"</w:t>
+            </w:r>
+          </w:p>
+          <w:p>
+            <w:pPr>
+              <w:spacing w:line="240" w:lineRule="auto"/>
+            </w:pPr>
+            <w:r>
+              <w:rPr>
+                <w:rFonts w:ascii="Courier New" w:hAnsi="Courier New" w:eastAsia="Courier New"/>
+                <w:sz w:val="15"/>
+              </w:rPr>
+              <w:t xml:space="preserve">            i=$((i + 1))</w:t>
+            </w:r>
+          </w:p>
+          <w:p>
+            <w:pPr>
+              <w:spacing w:line="240" w:lineRule="auto"/>
+            </w:pPr>
+            <w:r>
+              <w:rPr>
+                <w:rFonts w:ascii="Courier New" w:hAnsi="Courier New" w:eastAsia="Courier New"/>
+                <w:sz w:val="15"/>
+              </w:rPr>
+              <w:t xml:space="preserve">        done</w:t>
+            </w:r>
+          </w:p>
+          <w:p>
+            <w:pPr>
+              <w:spacing w:line="240" w:lineRule="auto"/>
+            </w:pPr>
+            <w:r>
+              <w:rPr>
+                <w:rFonts w:ascii="Courier New" w:hAnsi="Courier New" w:eastAsia="Courier New"/>
+                <w:sz w:val="15"/>
+              </w:rPr>
+              <w:t xml:space="preserve">        printf "\\\\i '%s'\n" "$file"</w:t>
+            </w:r>
+          </w:p>
+          <w:p>
+            <w:pPr>
+              <w:spacing w:line="240" w:lineRule="auto"/>
+            </w:pPr>
+            <w:r>
+              <w:rPr>
+                <w:rFonts w:ascii="Courier New" w:hAnsi="Courier New" w:eastAsia="Courier New"/>
+                <w:sz w:val="15"/>
+              </w:rPr>
+              <w:t xml:space="preserve">    } | psql -q -X -P pager=off -P "null=&lt;null&gt;" -f - 2&gt;&amp;1 | perl helper/fixenc.pl</w:t>
+            </w:r>
+          </w:p>
+          <w:p>
+            <w:pPr>
+              <w:spacing w:line="240" w:lineRule="auto"/>
+            </w:pPr>
+            <w:r>
+              <w:rPr>
+                <w:rFonts w:ascii="Courier New" w:hAnsi="Courier New" w:eastAsia="Courier New"/>
+                <w:sz w:val="15"/>
+              </w:rPr>
+              <w:t>}</w:t>
+            </w:r>
+          </w:p>
+          <w:p>
+            <w:pPr>
+              <w:spacing w:line="240" w:lineRule="auto"/>
+            </w:pPr>
+            <w:r>
+              <w:rPr>
+                <w:rFonts w:ascii="Courier New" w:hAnsi="Courier New" w:eastAsia="Courier New"/>
+                <w:sz w:val="15"/>
+              </w:rPr>
+              <w:t xml:space="preserve"> </w:t>
+            </w:r>
+          </w:p>
+          <w:p>
+            <w:pPr>
+              <w:spacing w:line="240" w:lineRule="auto"/>
+            </w:pPr>
+            <w:r>
+              <w:rPr>
+                <w:rFonts w:ascii="Courier New" w:hAnsi="Courier New" w:eastAsia="Courier New"/>
+                <w:sz w:val="15"/>
+              </w:rPr>
+              <w:t># psql-сценарий в системной базе postgres (как s1.bat)</w:t>
+            </w:r>
+          </w:p>
+          <w:p>
+            <w:pPr>
+              <w:spacing w:line="240" w:lineRule="auto"/>
+            </w:pPr>
+            <w:r>
+              <w:rPr>
+                <w:rFonts w:ascii="Courier New" w:hAnsi="Courier New" w:eastAsia="Courier New"/>
+                <w:sz w:val="15"/>
+              </w:rPr>
+              <w:t>run_pg() {</w:t>
+            </w:r>
+          </w:p>
+          <w:p>
+            <w:pPr>
+              <w:spacing w:line="240" w:lineRule="auto"/>
+            </w:pPr>
+            <w:r>
+              <w:rPr>
+                <w:rFonts w:ascii="Courier New" w:hAnsi="Courier New" w:eastAsia="Courier New"/>
+                <w:sz w:val="15"/>
+              </w:rPr>
+              <w:t xml:space="preserve">    PGDATABASE=postgres psql -q -X -P pager=off -f "$1" 2&gt;&amp;1 | perl helper/fixenc.pl</w:t>
+            </w:r>
+          </w:p>
+          <w:p>
+            <w:pPr>
+              <w:spacing w:line="240" w:lineRule="auto"/>
+            </w:pPr>
+            <w:r>
+              <w:rPr>
+                <w:rFonts w:ascii="Courier New" w:hAnsi="Courier New" w:eastAsia="Courier New"/>
+                <w:sz w:val="15"/>
+              </w:rPr>
+              <w:t>}</w:t>
+            </w:r>
+          </w:p>
+          <w:p>
+            <w:pPr>
+              <w:spacing w:line="240" w:lineRule="auto"/>
+            </w:pPr>
+            <w:r>
+              <w:rPr>
+                <w:rFonts w:ascii="Courier New" w:hAnsi="Courier New" w:eastAsia="Courier New"/>
+                <w:sz w:val="15"/>
+              </w:rPr>
+              <w:t xml:space="preserve"> </w:t>
+            </w:r>
+          </w:p>
+          <w:p>
+            <w:pPr>
+              <w:spacing w:line="240" w:lineRule="auto"/>
+            </w:pPr>
+            <w:r>
+              <w:rPr>
+                <w:rFonts w:ascii="Courier New" w:hAnsi="Courier New" w:eastAsia="Courier New"/>
+                <w:sz w:val="15"/>
+              </w:rPr>
+              <w:t># командный файл Windows: путь в формате Windows, параметры как есть</w:t>
+            </w:r>
+          </w:p>
+          <w:p>
+            <w:pPr>
+              <w:spacing w:line="240" w:lineRule="auto"/>
+            </w:pPr>
+            <w:r>
+              <w:rPr>
+                <w:rFonts w:ascii="Courier New" w:hAnsi="Courier New" w:eastAsia="Courier New"/>
+                <w:sz w:val="15"/>
+              </w:rPr>
+              <w:t>bat() {</w:t>
+            </w:r>
+          </w:p>
+          <w:p>
+            <w:pPr>
+              <w:spacing w:line="240" w:lineRule="auto"/>
+            </w:pPr>
+            <w:r>
+              <w:rPr>
+                <w:rFonts w:ascii="Courier New" w:hAnsi="Courier New" w:eastAsia="Courier New"/>
+                <w:sz w:val="15"/>
+              </w:rPr>
+              <w:t xml:space="preserve">    local file; file=$(cygpath -w "$1"); shift</w:t>
+            </w:r>
+          </w:p>
+          <w:p>
+            <w:pPr>
+              <w:spacing w:line="240" w:lineRule="auto"/>
+            </w:pPr>
+            <w:r>
+              <w:rPr>
+                <w:rFonts w:ascii="Courier New" w:hAnsi="Courier New" w:eastAsia="Courier New"/>
+                <w:sz w:val="15"/>
+              </w:rPr>
+              <w:t xml:space="preserve">    cmd.exe /c "$file" "$@"</w:t>
+            </w:r>
+          </w:p>
+          <w:p>
+            <w:pPr>
+              <w:spacing w:line="240" w:lineRule="auto"/>
+            </w:pPr>
+            <w:r>
+              <w:rPr>
+                <w:rFonts w:ascii="Courier New" w:hAnsi="Courier New" w:eastAsia="Courier New"/>
+                <w:sz w:val="15"/>
+              </w:rPr>
+              <w:t>}</w:t>
+            </w:r>
+          </w:p>
+          <w:p>
+            <w:pPr>
+              <w:spacing w:line="240" w:lineRule="auto"/>
+            </w:pPr>
+            <w:r>
+              <w:rPr>
+                <w:rFonts w:ascii="Courier New" w:hAnsi="Courier New" w:eastAsia="Courier New"/>
+                <w:sz w:val="15"/>
+              </w:rPr>
+              <w:t xml:space="preserve"> </w:t>
+            </w:r>
+          </w:p>
+          <w:p>
+            <w:pPr>
+              <w:spacing w:line="240" w:lineRule="auto"/>
+            </w:pPr>
+            <w:r>
+              <w:rPr>
+                <w:rFonts w:ascii="Courier New" w:hAnsi="Courier New" w:eastAsia="Courier New"/>
+                <w:sz w:val="15"/>
+              </w:rPr>
+              <w:t>need_variant() {</w:t>
+            </w:r>
+          </w:p>
+          <w:p>
+            <w:pPr>
+              <w:spacing w:line="240" w:lineRule="auto"/>
+            </w:pPr>
+            <w:r>
+              <w:rPr>
+                <w:rFonts w:ascii="Courier New" w:hAnsi="Courier New" w:eastAsia="Courier New"/>
+                <w:sz w:val="15"/>
+              </w:rPr>
+              <w:t xml:space="preserve">    if [ "$1" != "20" ] &amp;&amp; [ "$1" != "22" ]; then</w:t>
+            </w:r>
+          </w:p>
+          <w:p>
+            <w:pPr>
+              <w:spacing w:line="240" w:lineRule="auto"/>
+            </w:pPr>
+            <w:r>
+              <w:rPr>
+                <w:rFonts w:ascii="Courier New" w:hAnsi="Courier New" w:eastAsia="Courier New"/>
+                <w:sz w:val="15"/>
+              </w:rPr>
+              <w:t xml:space="preserve">        echo "ОШИБКА: Укажите вариант 20 или 22"</w:t>
+            </w:r>
+          </w:p>
+          <w:p>
+            <w:pPr>
+              <w:spacing w:line="240" w:lineRule="auto"/>
+            </w:pPr>
+            <w:r>
+              <w:rPr>
+                <w:rFonts w:ascii="Courier New" w:hAnsi="Courier New" w:eastAsia="Courier New"/>
+                <w:sz w:val="15"/>
+              </w:rPr>
+              <w:t xml:space="preserve">        exit 1</w:t>
+            </w:r>
+          </w:p>
+          <w:p>
+            <w:pPr>
+              <w:spacing w:line="240" w:lineRule="auto"/>
+            </w:pPr>
+            <w:r>
+              <w:rPr>
+                <w:rFonts w:ascii="Courier New" w:hAnsi="Courier New" w:eastAsia="Courier New"/>
+                <w:sz w:val="15"/>
+              </w:rPr>
+              <w:t xml:space="preserve">    fi</w:t>
+            </w:r>
+          </w:p>
+          <w:p>
+            <w:pPr>
+              <w:spacing w:line="240" w:lineRule="auto"/>
+            </w:pPr>
+            <w:r>
+              <w:rPr>
+                <w:rFonts w:ascii="Courier New" w:hAnsi="Courier New" w:eastAsia="Courier New"/>
+                <w:sz w:val="15"/>
+              </w:rPr>
+              <w:t>}</w:t>
+            </w:r>
+          </w:p>
+          <w:p>
+            <w:pPr>
+              <w:spacing w:line="240" w:lineRule="auto"/>
+            </w:pPr>
+            <w:r>
+              <w:rPr>
+                <w:rFonts w:ascii="Courier New" w:hAnsi="Courier New" w:eastAsia="Courier New"/>
+                <w:sz w:val="15"/>
+              </w:rPr>
+              <w:t xml:space="preserve"> </w:t>
+            </w:r>
+          </w:p>
+          <w:p>
+            <w:pPr>
+              <w:spacing w:line="240" w:lineRule="auto"/>
+            </w:pPr>
+            <w:r>
+              <w:rPr>
+                <w:rFonts w:ascii="Courier New" w:hAnsi="Courier New" w:eastAsia="Courier New"/>
+                <w:sz w:val="15"/>
+              </w:rPr>
+              <w:t>need_task() {</w:t>
+            </w:r>
+          </w:p>
+          <w:p>
+            <w:pPr>
+              <w:spacing w:line="240" w:lineRule="auto"/>
+            </w:pPr>
+            <w:r>
+              <w:rPr>
+                <w:rFonts w:ascii="Courier New" w:hAnsi="Courier New" w:eastAsia="Courier New"/>
+                <w:sz w:val="15"/>
+              </w:rPr>
+              <w:t xml:space="preserve">    if [ "$1" != "1" ] &amp;&amp; [ "$1" != "2" ]; then</w:t>
+            </w:r>
+          </w:p>
+          <w:p>
+            <w:pPr>
+              <w:spacing w:line="240" w:lineRule="auto"/>
+            </w:pPr>
+            <w:r>
+              <w:rPr>
+                <w:rFonts w:ascii="Courier New" w:hAnsi="Courier New" w:eastAsia="Courier New"/>
+                <w:sz w:val="15"/>
+              </w:rPr>
+              <w:t xml:space="preserve">        echo "ОШИБКА: Укажите номер задания 1 или 2"</w:t>
+            </w:r>
+          </w:p>
+          <w:p>
+            <w:pPr>
+              <w:spacing w:line="240" w:lineRule="auto"/>
+            </w:pPr>
+            <w:r>
+              <w:rPr>
+                <w:rFonts w:ascii="Courier New" w:hAnsi="Courier New" w:eastAsia="Courier New"/>
+                <w:sz w:val="15"/>
+              </w:rPr>
+              <w:t xml:space="preserve">        exit 1</w:t>
+            </w:r>
+          </w:p>
+          <w:p>
+            <w:pPr>
+              <w:spacing w:line="240" w:lineRule="auto"/>
+            </w:pPr>
+            <w:r>
+              <w:rPr>
+                <w:rFonts w:ascii="Courier New" w:hAnsi="Courier New" w:eastAsia="Courier New"/>
+                <w:sz w:val="15"/>
+              </w:rPr>
+              <w:t xml:space="preserve">    fi</w:t>
+            </w:r>
+          </w:p>
+          <w:p>
+            <w:pPr>
+              <w:spacing w:line="240" w:lineRule="auto"/>
+            </w:pPr>
+            <w:r>
+              <w:rPr>
+                <w:rFonts w:ascii="Courier New" w:hAnsi="Courier New" w:eastAsia="Courier New"/>
+                <w:sz w:val="15"/>
+              </w:rPr>
+              <w:t>}</w:t>
+            </w:r>
+          </w:p>
+          <w:p>
+            <w:pPr>
+              <w:spacing w:line="240" w:lineRule="auto"/>
+            </w:pPr>
+            <w:r>
+              <w:rPr>
+                <w:rFonts w:ascii="Courier New" w:hAnsi="Courier New" w:eastAsia="Courier New"/>
+                <w:sz w:val="15"/>
+              </w:rPr>
+              <w:t xml:space="preserve"> </w:t>
+            </w:r>
+          </w:p>
+          <w:p>
+            <w:pPr>
+              <w:spacing w:line="240" w:lineRule="auto"/>
+            </w:pPr>
+            <w:r>
+              <w:rPr>
+                <w:rFonts w:ascii="Courier New" w:hAnsi="Courier New" w:eastAsia="Courier New"/>
+                <w:sz w:val="15"/>
+              </w:rPr>
+              <w:t>if [ -z "$1" ]; then</w:t>
+            </w:r>
+          </w:p>
+          <w:p>
+            <w:pPr>
+              <w:spacing w:line="240" w:lineRule="auto"/>
+            </w:pPr>
+            <w:r>
+              <w:rPr>
+                <w:rFonts w:ascii="Courier New" w:hAnsi="Courier New" w:eastAsia="Courier New"/>
+                <w:sz w:val="15"/>
+              </w:rPr>
+              <w:t xml:space="preserve">    echo "============================================="</w:t>
+            </w:r>
+          </w:p>
+          <w:p>
+            <w:pPr>
+              <w:spacing w:line="240" w:lineRule="auto"/>
+            </w:pPr>
+            <w:r>
+              <w:rPr>
+                <w:rFonts w:ascii="Courier New" w:hAnsi="Courier New" w:eastAsia="Courier New"/>
+                <w:sz w:val="15"/>
+              </w:rPr>
+              <w:t xml:space="preserve">    echo "  ПАБД: БАЗА ДАННЫХ SALES, ВАРИАНТЫ 20 И 22"</w:t>
+            </w:r>
+          </w:p>
+          <w:p>
+            <w:pPr>
+              <w:spacing w:line="240" w:lineRule="auto"/>
+            </w:pPr>
+            <w:r>
+              <w:rPr>
+                <w:rFonts w:ascii="Courier New" w:hAnsi="Courier New" w:eastAsia="Courier New"/>
+                <w:sz w:val="15"/>
+              </w:rPr>
+              <w:t xml:space="preserve">    echo "============================================="</w:t>
+            </w:r>
+          </w:p>
+          <w:p>
+            <w:pPr>
+              <w:spacing w:line="240" w:lineRule="auto"/>
+            </w:pPr>
+            <w:r>
+              <w:rPr>
+                <w:rFonts w:ascii="Courier New" w:hAnsi="Courier New" w:eastAsia="Courier New"/>
+                <w:sz w:val="15"/>
+              </w:rPr>
+              <w:t xml:space="preserve">    echo ""</w:t>
+            </w:r>
+          </w:p>
+          <w:p>
+            <w:pPr>
+              <w:spacing w:line="240" w:lineRule="auto"/>
+            </w:pPr>
+            <w:r>
+              <w:rPr>
+                <w:rFonts w:ascii="Courier New" w:hAnsi="Courier New" w:eastAsia="Courier New"/>
+                <w:sz w:val="15"/>
+              </w:rPr>
+              <w:t xml:space="preserve">    echo "================== ЛР1: БАЗА И ЗАДАНИЯ =================="</w:t>
+            </w:r>
+          </w:p>
+          <w:p>
+            <w:pPr>
+              <w:spacing w:line="240" w:lineRule="auto"/>
+            </w:pPr>
+            <w:r>
+              <w:rPr>
+                <w:rFonts w:ascii="Courier New" w:hAnsi="Courier New" w:eastAsia="Courier New"/>
+                <w:sz w:val="15"/>
+              </w:rPr>
+              <w:t xml:space="preserve">    echo "  ./h db              - создать БД sales, таблицы и загрузить данные"</w:t>
+            </w:r>
+          </w:p>
+          <w:p>
+            <w:pPr>
+              <w:spacing w:line="240" w:lineRule="auto"/>
+            </w:pPr>
+            <w:r>
+              <w:rPr>
+                <w:rFonts w:ascii="Courier New" w:hAnsi="Courier New" w:eastAsia="Courier New"/>
+                <w:sz w:val="15"/>
+              </w:rPr>
+              <w:t xml:space="preserve">    echo "  ./h counts          - количество строк в таблицах"</w:t>
+            </w:r>
+          </w:p>
+          <w:p>
+            <w:pPr>
+              <w:spacing w:line="240" w:lineRule="auto"/>
+            </w:pPr>
+            <w:r>
+              <w:rPr>
+                <w:rFonts w:ascii="Courier New" w:hAnsi="Courier New" w:eastAsia="Courier New"/>
+                <w:sz w:val="15"/>
+              </w:rPr>
+              <w:t xml:space="preserve">    echo "  ./h v20 1 [дата1 дата2 [категория]]  - в.20: объём поставок по категории и кварталу"</w:t>
+            </w:r>
+          </w:p>
+          <w:p>
+            <w:pPr>
+              <w:spacing w:line="240" w:lineRule="auto"/>
+            </w:pPr>
+            <w:r>
+              <w:rPr>
+                <w:rFonts w:ascii="Courier New" w:hAnsi="Courier New" w:eastAsia="Courier New"/>
+                <w:sz w:val="15"/>
+              </w:rPr>
+              <w:t xml:space="preserve">    echo "  ./h v20 2 [год1 год2 [день недели]]  - в.20: продажи (шт) по дню недели и району"</w:t>
+            </w:r>
+          </w:p>
+          <w:p>
+            <w:pPr>
+              <w:spacing w:line="240" w:lineRule="auto"/>
+            </w:pPr>
+            <w:r>
+              <w:rPr>
+                <w:rFonts w:ascii="Courier New" w:hAnsi="Courier New" w:eastAsia="Courier New"/>
+                <w:sz w:val="15"/>
+              </w:rPr>
+              <w:t xml:space="preserve">    echo "  ./h v22 1 [дата1 дата2 [поставщик]]  - в.22: выручка по поставщику и декаде"</w:t>
+            </w:r>
+          </w:p>
+          <w:p>
+            <w:pPr>
+              <w:spacing w:line="240" w:lineRule="auto"/>
+            </w:pPr>
+            <w:r>
+              <w:rPr>
+                <w:rFonts w:ascii="Courier New" w:hAnsi="Courier New" w:eastAsia="Courier New"/>
+                <w:sz w:val="15"/>
+              </w:rPr>
+              <w:t xml:space="preserve">    echo "  ./h v22 2 [год1 год2 [время года]]   - в.22: затраты клиентов по сезону и полу"</w:t>
+            </w:r>
+          </w:p>
+          <w:p>
+            <w:pPr>
+              <w:spacing w:line="240" w:lineRule="auto"/>
+            </w:pPr>
+            <w:r>
+              <w:rPr>
+                <w:rFonts w:ascii="Courier New" w:hAnsi="Courier New" w:eastAsia="Courier New"/>
+                <w:sz w:val="15"/>
+              </w:rPr>
+              <w:t xml:space="preserve">    echo "  ./h all             - все 4 задания с параметрами по умолчанию"</w:t>
+            </w:r>
+          </w:p>
+          <w:p>
+            <w:pPr>
+              <w:spacing w:line="240" w:lineRule="auto"/>
+            </w:pPr>
+            <w:r>
+              <w:rPr>
+                <w:rFonts w:ascii="Courier New" w:hAnsi="Courier New" w:eastAsia="Courier New"/>
+                <w:sz w:val="15"/>
+              </w:rPr>
+              <w:t xml:space="preserve">    echo "  ./h lr1 lan         - настроить pg_hba.conf и брандмауэр для сети (от администратора)"</w:t>
+            </w:r>
+          </w:p>
+          <w:p>
+            <w:pPr>
+              <w:spacing w:line="240" w:lineRule="auto"/>
+            </w:pPr>
+            <w:r>
+              <w:rPr>
+                <w:rFonts w:ascii="Courier New" w:hAnsi="Courier New" w:eastAsia="Courier New"/>
+                <w:sz w:val="15"/>
+              </w:rPr>
+              <w:t xml:space="preserve">    echo "  ./h lr1 client сценарий [a1 a2 a3] - выполнить сценарий через s_lan.bat (сервер по IP)"</w:t>
+            </w:r>
+          </w:p>
+          <w:p>
+            <w:pPr>
+              <w:spacing w:line="240" w:lineRule="auto"/>
+            </w:pPr>
+            <w:r>
+              <w:rPr>
+                <w:rFonts w:ascii="Courier New" w:hAnsi="Courier New" w:eastAsia="Courier New"/>
+                <w:sz w:val="15"/>
+              </w:rPr>
+              <w:t xml:space="preserve">    echo "  Пример: ./h v20 1 01.01.2021 31.12.2022 мебель"</w:t>
+            </w:r>
+          </w:p>
+          <w:p>
+            <w:pPr>
+              <w:spacing w:line="240" w:lineRule="auto"/>
+            </w:pPr>
+            <w:r>
+              <w:rPr>
+                <w:rFonts w:ascii="Courier New" w:hAnsi="Courier New" w:eastAsia="Courier New"/>
+                <w:sz w:val="15"/>
+              </w:rPr>
+              <w:t xml:space="preserve">    echo ""</w:t>
+            </w:r>
+          </w:p>
+          <w:p>
+            <w:pPr>
+              <w:spacing w:line="240" w:lineRule="auto"/>
+            </w:pPr>
+            <w:r>
+              <w:rPr>
+                <w:rFonts w:ascii="Courier New" w:hAnsi="Courier New" w:eastAsia="Courier New"/>
+                <w:sz w:val="15"/>
+              </w:rPr>
+              <w:t xml:space="preserve">    echo "================== ЛР2: ОБЪЁМНАЯ БД, ИНДЕКСЫ, EXPLAIN =================="</w:t>
+            </w:r>
+          </w:p>
+          <w:p>
+            <w:pPr>
+              <w:spacing w:line="240" w:lineRule="auto"/>
+            </w:pPr>
+            <w:r>
+              <w:rPr>
+                <w:rFonts w:ascii="Courier New" w:hAnsi="Courier New" w:eastAsia="Courier New"/>
+                <w:sz w:val="15"/>
+              </w:rPr>
+              <w:t xml:space="preserve">    echo "  ./h lr2 gen [N]           - ПРОДАЖА: N псевдослучайных записей (по умолч. 2 000 000)"</w:t>
+            </w:r>
+          </w:p>
+          <w:p>
+            <w:pPr>
+              <w:spacing w:line="240" w:lineRule="auto"/>
+            </w:pPr>
+            <w:r>
+              <w:rPr>
+                <w:rFonts w:ascii="Courier New" w:hAnsi="Courier New" w:eastAsia="Courier New"/>
+                <w:sz w:val="15"/>
+              </w:rPr>
+              <w:t xml:space="preserve">    echo "  ./h lr2 restore           - вернуть 1000 записей ПРОДАЖА из ЛР1"</w:t>
+            </w:r>
+          </w:p>
+          <w:p>
+            <w:pPr>
+              <w:spacing w:line="240" w:lineRule="auto"/>
+            </w:pPr>
+            <w:r>
+              <w:rPr>
+                <w:rFonts w:ascii="Courier New" w:hAnsi="Courier New" w:eastAsia="Courier New"/>
+                <w:sz w:val="15"/>
+              </w:rPr>
+              <w:t xml:space="preserve">    echo "  ./h lr2 tbs [каталог]     - вынести ПРОДАЖА в табличное пространство (D:/PG_TBS)"</w:t>
+            </w:r>
+          </w:p>
+          <w:p>
+            <w:pPr>
+              <w:spacing w:line="240" w:lineRule="auto"/>
+            </w:pPr>
+            <w:r>
+              <w:rPr>
+                <w:rFonts w:ascii="Courier New" w:hAnsi="Courier New" w:eastAsia="Courier New"/>
+                <w:sz w:val="15"/>
+              </w:rPr>
+              <w:t xml:space="preserve">    echo "  ./h lr2 time 20|22        - время запроса (*) по CURRENT_TIME, 5 замеров"</w:t>
+            </w:r>
+          </w:p>
+          <w:p>
+            <w:pPr>
+              <w:spacing w:line="240" w:lineRule="auto"/>
+            </w:pPr>
+            <w:r>
+              <w:rPr>
+                <w:rFonts w:ascii="Courier New" w:hAnsi="Courier New" w:eastAsia="Courier New"/>
+                <w:sz w:val="15"/>
+              </w:rPr>
+              <w:t xml:space="preserve">    echo "  ./h lr2 timing 20|22      - время запроса (*) по \\timing on, 5 замеров"</w:t>
+            </w:r>
+          </w:p>
+          <w:p>
+            <w:pPr>
+              <w:spacing w:line="240" w:lineRule="auto"/>
+            </w:pPr>
+            <w:r>
+              <w:rPr>
+                <w:rFonts w:ascii="Courier New" w:hAnsi="Courier New" w:eastAsia="Courier New"/>
+                <w:sz w:val="15"/>
+              </w:rPr>
+              <w:t xml:space="preserve">    echo "  ./h lr2 idx 20|22         - индексы ПРОДАЖА и таблицы-справочника"</w:t>
+            </w:r>
+          </w:p>
+          <w:p>
+            <w:pPr>
+              <w:spacing w:line="240" w:lineRule="auto"/>
+            </w:pPr>
+            <w:r>
+              <w:rPr>
+                <w:rFonts w:ascii="Courier New" w:hAnsi="Courier New" w:eastAsia="Courier New"/>
+                <w:sz w:val="15"/>
+              </w:rPr>
+              <w:t xml:space="preserve">    echo "  ./h lr2 idx1 20|22 [btree|hash] - создать индекс ПРОДАЖА по полю-ссылке"</w:t>
+            </w:r>
+          </w:p>
+          <w:p>
+            <w:pPr>
+              <w:spacing w:line="240" w:lineRule="auto"/>
+            </w:pPr>
+            <w:r>
+              <w:rPr>
+                <w:rFonts w:ascii="Courier New" w:hAnsi="Courier New" w:eastAsia="Courier New"/>
+                <w:sz w:val="15"/>
+              </w:rPr>
+              <w:t xml:space="preserve">    echo "  ./h lr2 idx0 20|22        - удалить индекс ПРОДАЖА по полю-ссылке"</w:t>
+            </w:r>
+          </w:p>
+          <w:p>
+            <w:pPr>
+              <w:spacing w:line="240" w:lineRule="auto"/>
+            </w:pPr>
+            <w:r>
+              <w:rPr>
+                <w:rFonts w:ascii="Courier New" w:hAnsi="Courier New" w:eastAsia="Courier New"/>
+                <w:sz w:val="15"/>
+              </w:rPr>
+              <w:t xml:space="preserve">    echo "  ./h lr2 pk1 20|22         - справочник с PRIMARY KEY (create_ref0)"</w:t>
+            </w:r>
+          </w:p>
+          <w:p>
+            <w:pPr>
+              <w:spacing w:line="240" w:lineRule="auto"/>
+            </w:pPr>
+            <w:r>
+              <w:rPr>
+                <w:rFonts w:ascii="Courier New" w:hAnsi="Courier New" w:eastAsia="Courier New"/>
+                <w:sz w:val="15"/>
+              </w:rPr>
+              <w:t xml:space="preserve">    echo "  ./h lr2 pk0 20|22         - справочник без PRIMARY KEY (create_ref1)"</w:t>
+            </w:r>
+          </w:p>
+          <w:p>
+            <w:pPr>
+              <w:spacing w:line="240" w:lineRule="auto"/>
+            </w:pPr>
+            <w:r>
+              <w:rPr>
+                <w:rFonts w:ascii="Courier New" w:hAnsi="Courier New" w:eastAsia="Courier New"/>
+                <w:sz w:val="15"/>
+              </w:rPr>
+              <w:t xml:space="preserve">    echo "  ./h lr2 copy 20|22        - перезагрузить справочник из DATA/SOURCE"</w:t>
+            </w:r>
+          </w:p>
+          <w:p>
+            <w:pPr>
+              <w:spacing w:line="240" w:lineRule="auto"/>
+            </w:pPr>
+            <w:r>
+              <w:rPr>
+                <w:rFonts w:ascii="Courier New" w:hAnsi="Courier New" w:eastAsia="Courier New"/>
+                <w:sz w:val="15"/>
+              </w:rPr>
+              <w:t xml:space="preserve">    echo "  ./h lr2 explain 20|22 [1] - EXPLAIN / EXPLAIN ANALYZE (1 - с WHERE)"</w:t>
+            </w:r>
+          </w:p>
+          <w:p>
+            <w:pPr>
+              <w:spacing w:line="240" w:lineRule="auto"/>
+            </w:pPr>
+            <w:r>
+              <w:rPr>
+                <w:rFonts w:ascii="Courier New" w:hAnsi="Courier New" w:eastAsia="Courier New"/>
+                <w:sz w:val="15"/>
+              </w:rPr>
+              <w:t xml:space="preserve">    echo "  ./h lr2 measure 20|22 [прогонов] - протокол замеров -&gt; results/lr2_vNN_results.txt"</w:t>
+            </w:r>
+          </w:p>
+          <w:p>
+            <w:pPr>
+              <w:spacing w:line="240" w:lineRule="auto"/>
+            </w:pPr>
+            <w:r>
+              <w:rPr>
+                <w:rFonts w:ascii="Courier New" w:hAnsi="Courier New" w:eastAsia="Courier New"/>
+                <w:sz w:val="15"/>
+              </w:rPr>
+              <w:t xml:space="preserve">    echo "  ./h lr2 results 20|22     - показать протокол замеров"</w:t>
+            </w:r>
+          </w:p>
+          <w:p>
+            <w:pPr>
+              <w:spacing w:line="240" w:lineRule="auto"/>
+            </w:pPr>
+            <w:r>
+              <w:rPr>
+                <w:rFonts w:ascii="Courier New" w:hAnsi="Courier New" w:eastAsia="Courier New"/>
+                <w:sz w:val="15"/>
+              </w:rPr>
+              <w:t xml:space="preserve">    echo ""</w:t>
+            </w:r>
+          </w:p>
+          <w:p>
+            <w:pPr>
+              <w:spacing w:line="240" w:lineRule="auto"/>
+            </w:pPr>
+            <w:r>
+              <w:rPr>
+                <w:rFonts w:ascii="Courier New" w:hAnsi="Courier New" w:eastAsia="Courier New"/>
+                <w:sz w:val="15"/>
+              </w:rPr>
+              <w:t xml:space="preserve">    echo "================== ЛР3: ПОЛЬЗОВАТЕЛЬСКИЕ ТИПЫ =================="</w:t>
+            </w:r>
+          </w:p>
+          <w:p>
+            <w:pPr>
+              <w:spacing w:line="240" w:lineRule="auto"/>
+            </w:pPr>
+            <w:r>
+              <w:rPr>
+                <w:rFonts w:ascii="Courier New" w:hAnsi="Courier New" w:eastAsia="Courier New"/>
+                <w:sz w:val="15"/>
+              </w:rPr>
+              <w:t xml:space="preserve">    echo "  ./h lr3 cmplx             - пример преподавателя (complex)"</w:t>
+            </w:r>
+          </w:p>
+          <w:p>
+            <w:pPr>
+              <w:spacing w:line="240" w:lineRule="auto"/>
+            </w:pPr>
+            <w:r>
+              <w:rPr>
+                <w:rFonts w:ascii="Courier New" w:hAnsi="Courier New" w:eastAsia="Courier New"/>
+                <w:sz w:val="15"/>
+              </w:rPr>
+              <w:t xml:space="preserve">    echo "  ./h lr3 20                - в.20: трёхмерный вектор (vector3)"</w:t>
+            </w:r>
+          </w:p>
+          <w:p>
+            <w:pPr>
+              <w:spacing w:line="240" w:lineRule="auto"/>
+            </w:pPr>
+            <w:r>
+              <w:rPr>
+                <w:rFonts w:ascii="Courier New" w:hAnsi="Courier New" w:eastAsia="Courier New"/>
+                <w:sz w:val="15"/>
+              </w:rPr>
+              <w:t xml:space="preserve">    echo "  ./h lr3 22                - в.22: рациональное число (rational)"</w:t>
+            </w:r>
+          </w:p>
+          <w:p>
+            <w:pPr>
+              <w:spacing w:line="240" w:lineRule="auto"/>
+            </w:pPr>
+            <w:r>
+              <w:rPr>
+                <w:rFonts w:ascii="Courier New" w:hAnsi="Courier New" w:eastAsia="Courier New"/>
+                <w:sz w:val="15"/>
+              </w:rPr>
+              <w:t xml:space="preserve">    echo ""</w:t>
+            </w:r>
+          </w:p>
+          <w:p>
+            <w:pPr>
+              <w:spacing w:line="240" w:lineRule="auto"/>
+            </w:pPr>
+            <w:r>
+              <w:rPr>
+                <w:rFonts w:ascii="Courier New" w:hAnsi="Courier New" w:eastAsia="Courier New"/>
+                <w:sz w:val="15"/>
+              </w:rPr>
+              <w:t xml:space="preserve">    echo "================== ЛР4: РЕЗЕРВНОЕ КОПИРОВАНИЕ =================="</w:t>
+            </w:r>
+          </w:p>
+          <w:p>
+            <w:pPr>
+              <w:spacing w:line="240" w:lineRule="auto"/>
+            </w:pPr>
+            <w:r>
+              <w:rPr>
+                <w:rFonts w:ascii="Courier New" w:hAnsi="Courier New" w:eastAsia="Courier New"/>
+                <w:sz w:val="15"/>
+              </w:rPr>
+              <w:t xml:space="preserve">    echo "  ./h lr4 all [20|22]       - пп. 1-10 целиком -&gt; results/lr4_vNN_protocol.txt"</w:t>
+            </w:r>
+          </w:p>
+          <w:p>
+            <w:pPr>
+              <w:spacing w:line="240" w:lineRule="auto"/>
+            </w:pPr>
+            <w:r>
+              <w:rPr>
+                <w:rFonts w:ascii="Courier New" w:hAnsi="Courier New" w:eastAsia="Courier New"/>
+                <w:sz w:val="15"/>
+              </w:rPr>
+              <w:t xml:space="preserve">    echo "  ./h lr4 base              - создать базу BASE из данных ЛР1"</w:t>
+            </w:r>
+          </w:p>
+          <w:p>
+            <w:pPr>
+              <w:spacing w:line="240" w:lineRule="auto"/>
+            </w:pPr>
+            <w:r>
+              <w:rPr>
+                <w:rFonts w:ascii="Courier New" w:hAnsi="Courier New" w:eastAsia="Courier New"/>
+                <w:sz w:val="15"/>
+              </w:rPr>
+              <w:t xml:space="preserve">    echo "  ./h lr4 tasks N [база]    - контрольные задачи -&gt; taskN-01..03"</w:t>
+            </w:r>
+          </w:p>
+          <w:p>
+            <w:pPr>
+              <w:spacing w:line="240" w:lineRule="auto"/>
+            </w:pPr>
+            <w:r>
+              <w:rPr>
+                <w:rFonts w:ascii="Courier New" w:hAnsi="Courier New" w:eastAsia="Courier New"/>
+                <w:sz w:val="15"/>
+              </w:rPr>
+              <w:t xml:space="preserve">    echo "  ./h lr4 dump1|dump2|dump3 - pg_dump в файл / rar / многотомный rar"</w:t>
+            </w:r>
+          </w:p>
+          <w:p>
+            <w:pPr>
+              <w:spacing w:line="240" w:lineRule="auto"/>
+            </w:pPr>
+            <w:r>
+              <w:rPr>
+                <w:rFonts w:ascii="Courier New" w:hAnsi="Courier New" w:eastAsia="Courier New"/>
+                <w:sz w:val="15"/>
+              </w:rPr>
+              <w:t xml:space="preserve">    echo "  (каталог копий: lab4/work или LR4_WORK=D:/LR4_WORK ./h lr4 all)"</w:t>
+            </w:r>
+          </w:p>
+          <w:p>
+            <w:pPr>
+              <w:spacing w:line="240" w:lineRule="auto"/>
+            </w:pPr>
+            <w:r>
+              <w:rPr>
+                <w:rFonts w:ascii="Courier New" w:hAnsi="Courier New" w:eastAsia="Courier New"/>
+                <w:sz w:val="15"/>
+              </w:rPr>
+              <w:t xml:space="preserve">    echo ""</w:t>
+            </w:r>
+          </w:p>
+          <w:p>
+            <w:pPr>
+              <w:spacing w:line="240" w:lineRule="auto"/>
+            </w:pPr>
+            <w:r>
+              <w:rPr>
+                <w:rFonts w:ascii="Courier New" w:hAnsi="Courier New" w:eastAsia="Courier New"/>
+                <w:sz w:val="15"/>
+              </w:rPr>
+              <w:t xml:space="preserve">    echo "================== ЛР5: ФУНКЦИИ НА C =================="</w:t>
+            </w:r>
+          </w:p>
+          <w:p>
+            <w:pPr>
+              <w:spacing w:line="240" w:lineRule="auto"/>
+            </w:pPr>
+            <w:r>
+              <w:rPr>
+                <w:rFonts w:ascii="Courier New" w:hAnsi="Courier New" w:eastAsia="Courier New"/>
+                <w:sz w:val="15"/>
+              </w:rPr>
+              <w:t xml:space="preserve">    echo "  ./h lr5 build 20|22       - компиляция и сборка vNN.dll (-&gt; D:\\PG_DLL)"</w:t>
+            </w:r>
+          </w:p>
+          <w:p>
+            <w:pPr>
+              <w:spacing w:line="240" w:lineRule="auto"/>
+            </w:pPr>
+            <w:r>
+              <w:rPr>
+                <w:rFonts w:ascii="Courier New" w:hAnsi="Courier New" w:eastAsia="Courier New"/>
+                <w:sz w:val="15"/>
+              </w:rPr>
+              <w:t xml:space="preserve">    echo "  ./h lr5 20|22 [каталог]   - регистрация функций и демонстрация на таблице T"</w:t>
+            </w:r>
+          </w:p>
+          <w:p>
+            <w:pPr>
+              <w:spacing w:line="240" w:lineRule="auto"/>
+            </w:pPr>
+            <w:r>
+              <w:rPr>
+                <w:rFonts w:ascii="Courier New" w:hAnsi="Courier New" w:eastAsia="Courier New"/>
+                <w:sz w:val="15"/>
+              </w:rPr>
+              <w:t xml:space="preserve">    echo ""</w:t>
+            </w:r>
+          </w:p>
+          <w:p>
+            <w:pPr>
+              <w:spacing w:line="240" w:lineRule="auto"/>
+            </w:pPr>
+            <w:r>
+              <w:rPr>
+                <w:rFonts w:ascii="Courier New" w:hAnsi="Courier New" w:eastAsia="Courier New"/>
+                <w:sz w:val="15"/>
+              </w:rPr>
+              <w:t xml:space="preserve">    echo "================== ЛР6: КОПИРОВАНИЕ В MS SQL SERVER =================="</w:t>
+            </w:r>
+          </w:p>
+          <w:p>
+            <w:pPr>
+              <w:spacing w:line="240" w:lineRule="auto"/>
+            </w:pPr>
+            <w:r>
+              <w:rPr>
+                <w:rFonts w:ascii="Courier New" w:hAnsi="Courier New" w:eastAsia="Courier New"/>
+                <w:sz w:val="15"/>
+              </w:rPr>
+              <w:t xml:space="preserve">    echo "  ./h lr6 setup             - проверка сервера (база NEW1, таблица temp1)"</w:t>
+            </w:r>
+          </w:p>
+          <w:p>
+            <w:pPr>
+              <w:spacing w:line="240" w:lineRule="auto"/>
+            </w:pPr>
+            <w:r>
+              <w:rPr>
+                <w:rFonts w:ascii="Courier New" w:hAnsi="Courier New" w:eastAsia="Courier New"/>
+                <w:sz w:val="15"/>
+              </w:rPr>
+              <w:t xml:space="preserve">    echo "  ./h lr6 sel2              - собрать фильтр sel2.exe"</w:t>
+            </w:r>
+          </w:p>
+          <w:p>
+            <w:pPr>
+              <w:spacing w:line="240" w:lineRule="auto"/>
+            </w:pPr>
+            <w:r>
+              <w:rPr>
+                <w:rFonts w:ascii="Courier New" w:hAnsi="Courier New" w:eastAsia="Courier New"/>
+                <w:sz w:val="15"/>
+              </w:rPr>
+              <w:t xml:space="preserve">    echo "  ./h lr6 createdb          - создать базу SALES в MS SQL Server"</w:t>
+            </w:r>
+          </w:p>
+          <w:p>
+            <w:pPr>
+              <w:spacing w:line="240" w:lineRule="auto"/>
+            </w:pPr>
+            <w:r>
+              <w:rPr>
+                <w:rFonts w:ascii="Courier New" w:hAnsi="Courier New" w:eastAsia="Courier New"/>
+                <w:sz w:val="15"/>
+              </w:rPr>
+              <w:t xml:space="preserve">    echo "  ./h lr6 copy              - скопировать все таблицы sales из PostgreSQL"</w:t>
+            </w:r>
+          </w:p>
+          <w:p>
+            <w:pPr>
+              <w:spacing w:line="240" w:lineRule="auto"/>
+            </w:pPr>
+            <w:r>
+              <w:rPr>
+                <w:rFonts w:ascii="Courier New" w:hAnsi="Courier New" w:eastAsia="Courier New"/>
+                <w:sz w:val="15"/>
+              </w:rPr>
+              <w:t xml:space="preserve">    echo "  ./h lr6 disp              - проверить скопированные таблицы"</w:t>
+            </w:r>
+          </w:p>
+          <w:p>
+            <w:pPr>
+              <w:spacing w:line="240" w:lineRule="auto"/>
+            </w:pPr>
+            <w:r>
+              <w:rPr>
+                <w:rFonts w:ascii="Courier New" w:hAnsi="Courier New" w:eastAsia="Courier New"/>
+                <w:sz w:val="15"/>
+              </w:rPr>
+              <w:t xml:space="preserve">    echo "  ./h lr6 v20|v22 1|2 [параметры] - задания варианта в MS SQL Server"</w:t>
+            </w:r>
+          </w:p>
+          <w:p>
+            <w:pPr>
+              <w:spacing w:line="240" w:lineRule="auto"/>
+            </w:pPr>
+            <w:r>
+              <w:rPr>
+                <w:rFonts w:ascii="Courier New" w:hAnsi="Courier New" w:eastAsia="Courier New"/>
+                <w:sz w:val="15"/>
+              </w:rPr>
+              <w:t xml:space="preserve">    echo "  ./h lr6 console           - консоль sqlcmd"</w:t>
+            </w:r>
+          </w:p>
+          <w:p>
+            <w:pPr>
+              <w:spacing w:line="240" w:lineRule="auto"/>
+            </w:pPr>
+            <w:r>
+              <w:rPr>
+                <w:rFonts w:ascii="Courier New" w:hAnsi="Courier New" w:eastAsia="Courier New"/>
+                <w:sz w:val="15"/>
+              </w:rPr>
+              <w:t xml:space="preserve">    echo ""</w:t>
+            </w:r>
+          </w:p>
+          <w:p>
+            <w:pPr>
+              <w:spacing w:line="240" w:lineRule="auto"/>
+            </w:pPr>
+            <w:r>
+              <w:rPr>
+                <w:rFonts w:ascii="Courier New" w:hAnsi="Courier New" w:eastAsia="Courier New"/>
+                <w:sz w:val="15"/>
+              </w:rPr>
+              <w:t xml:space="preserve">    echo "================== ЛР7: ПРЕДСТАВЛЕНИЯ И ФУНКЦИИ MS SQL SERVER =================="</w:t>
+            </w:r>
+          </w:p>
+          <w:p>
+            <w:pPr>
+              <w:spacing w:line="240" w:lineRule="auto"/>
+            </w:pPr>
+            <w:r>
+              <w:rPr>
+                <w:rFonts w:ascii="Courier New" w:hAnsi="Courier New" w:eastAsia="Courier New"/>
+                <w:sz w:val="15"/>
+              </w:rPr>
+              <w:t xml:space="preserve">    echo "  ./h lr7 create            - создать представления и функции"</w:t>
+            </w:r>
+          </w:p>
+          <w:p>
+            <w:pPr>
+              <w:spacing w:line="240" w:lineRule="auto"/>
+            </w:pPr>
+            <w:r>
+              <w:rPr>
+                <w:rFonts w:ascii="Courier New" w:hAnsi="Courier New" w:eastAsia="Courier New"/>
+                <w:sz w:val="15"/>
+              </w:rPr>
+              <w:t xml:space="preserve">    echo "  ./h lr7 1 [D1 D2 P M [N]] - премия сотрудников (N - имя сотрудника)"</w:t>
+            </w:r>
+          </w:p>
+          <w:p>
+            <w:pPr>
+              <w:spacing w:line="240" w:lineRule="auto"/>
+            </w:pPr>
+            <w:r>
+              <w:rPr>
+                <w:rFonts w:ascii="Courier New" w:hAnsi="Courier New" w:eastAsia="Courier New"/>
+                <w:sz w:val="15"/>
+              </w:rPr>
+              <w:t xml:space="preserve">    echo "  ./h lr7 2 [D1 D2 alpha [G]] - затраты на хранение (G - товар)"</w:t>
+            </w:r>
+          </w:p>
+          <w:p>
+            <w:pPr>
+              <w:spacing w:line="240" w:lineRule="auto"/>
+            </w:pPr>
+            <w:r>
+              <w:rPr>
+                <w:rFonts w:ascii="Courier New" w:hAnsi="Courier New" w:eastAsia="Courier New"/>
+                <w:sz w:val="15"/>
+              </w:rPr>
+              <w:t xml:space="preserve">    echo "  Пример: ./h lr7 1 01.01.2021 30.06.2021 8.5 10.5 Иван"</w:t>
+            </w:r>
+          </w:p>
+          <w:p>
+            <w:pPr>
+              <w:spacing w:line="240" w:lineRule="auto"/>
+            </w:pPr>
+            <w:r>
+              <w:rPr>
+                <w:rFonts w:ascii="Courier New" w:hAnsi="Courier New" w:eastAsia="Courier New"/>
+                <w:sz w:val="15"/>
+              </w:rPr>
+              <w:t xml:space="preserve">    echo ""</w:t>
+            </w:r>
+          </w:p>
+          <w:p>
+            <w:pPr>
+              <w:spacing w:line="240" w:lineRule="auto"/>
+            </w:pPr>
+            <w:r>
+              <w:rPr>
+                <w:rFonts w:ascii="Courier New" w:hAnsi="Courier New" w:eastAsia="Courier New"/>
+                <w:sz w:val="15"/>
+              </w:rPr>
+              <w:t xml:space="preserve">    echo "================== ЛР8: ПРОГРАММЫ С ДАННЫМИ MS SQL SERVER =================="</w:t>
+            </w:r>
+          </w:p>
+          <w:p>
+            <w:pPr>
+              <w:spacing w:line="240" w:lineRule="auto"/>
+            </w:pPr>
+            <w:r>
+              <w:rPr>
+                <w:rFonts w:ascii="Courier New" w:hAnsi="Courier New" w:eastAsia="Courier New"/>
+                <w:sz w:val="15"/>
+              </w:rPr>
+              <w:t xml:space="preserve">    echo "  ./h lr8 build             - компиляция программы C# варианта 20"</w:t>
+            </w:r>
+          </w:p>
+          <w:p>
+            <w:pPr>
+              <w:spacing w:line="240" w:lineRule="auto"/>
+            </w:pPr>
+            <w:r>
+              <w:rPr>
+                <w:rFonts w:ascii="Courier New" w:hAnsi="Courier New" w:eastAsia="Courier New"/>
+                <w:sz w:val="15"/>
+              </w:rPr>
+              <w:t xml:space="preserve">    echo "  ./h lr8 20 [D1 D2 [категория]] - в.20 (C#): продажи (шт) по категории и кварталу"</w:t>
+            </w:r>
+          </w:p>
+          <w:p>
+            <w:pPr>
+              <w:spacing w:line="240" w:lineRule="auto"/>
+            </w:pPr>
+            <w:r>
+              <w:rPr>
+                <w:rFonts w:ascii="Courier New" w:hAnsi="Courier New" w:eastAsia="Courier New"/>
+                <w:sz w:val="15"/>
+              </w:rPr>
+              <w:t xml:space="preserve">    echo "  ./h lr8 22 [D1 D2 [поставщик]] - в.22 (Python): затраты клиентов по поставщику и декаде"</w:t>
+            </w:r>
+          </w:p>
+          <w:p>
+            <w:pPr>
+              <w:spacing w:line="240" w:lineRule="auto"/>
+            </w:pPr>
+            <w:r>
+              <w:rPr>
+                <w:rFonts w:ascii="Courier New" w:hAnsi="Courier New" w:eastAsia="Courier New"/>
+                <w:sz w:val="15"/>
+              </w:rPr>
+              <w:t xml:space="preserve">    echo ""</w:t>
+            </w:r>
+          </w:p>
+          <w:p>
+            <w:pPr>
+              <w:spacing w:line="240" w:lineRule="auto"/>
+            </w:pPr>
+            <w:r>
+              <w:rPr>
+                <w:rFonts w:ascii="Courier New" w:hAnsi="Courier New" w:eastAsia="Courier New"/>
+                <w:sz w:val="15"/>
+              </w:rPr>
+              <w:t xml:space="preserve">    echo "================== ПРОЧЕЕ =================="</w:t>
+            </w:r>
+          </w:p>
+          <w:p>
+            <w:pPr>
+              <w:spacing w:line="240" w:lineRule="auto"/>
+            </w:pPr>
+            <w:r>
+              <w:rPr>
+                <w:rFonts w:ascii="Courier New" w:hAnsi="Courier New" w:eastAsia="Courier New"/>
+                <w:sz w:val="15"/>
+              </w:rPr>
+              <w:t xml:space="preserve">    echo "  ./h reports [N ...]       - пересобрать отчёты .docx (reports/docx)"</w:t>
+            </w:r>
+          </w:p>
+          <w:p>
+            <w:pPr>
+              <w:spacing w:line="240" w:lineRule="auto"/>
+            </w:pPr>
+            <w:r>
+              <w:rPr>
+                <w:rFonts w:ascii="Courier New" w:hAnsi="Courier New" w:eastAsia="Courier New"/>
+                <w:sz w:val="15"/>
+              </w:rPr>
+              <w:t xml:space="preserve">    echo "  ./h psql                  - консоль psql (база sales)"</w:t>
+            </w:r>
+          </w:p>
+          <w:p>
+            <w:pPr>
+              <w:spacing w:line="240" w:lineRule="auto"/>
+            </w:pPr>
+            <w:r>
+              <w:rPr>
+                <w:rFonts w:ascii="Courier New" w:hAnsi="Courier New" w:eastAsia="Courier New"/>
+                <w:sz w:val="15"/>
+              </w:rPr>
+              <w:t xml:space="preserve">    echo "  ./h файл.sql [a1 [a2 [a3]]] - выполнить любой psql-сценарий с параметрами"</w:t>
+            </w:r>
+          </w:p>
+          <w:p>
+            <w:pPr>
+              <w:spacing w:line="240" w:lineRule="auto"/>
+            </w:pPr>
+            <w:r>
+              <w:rPr>
+                <w:rFonts w:ascii="Courier New" w:hAnsi="Courier New" w:eastAsia="Courier New"/>
+                <w:sz w:val="15"/>
+              </w:rPr>
+              <w:t xml:space="preserve">    exit 1</w:t>
+            </w:r>
+          </w:p>
+          <w:p>
+            <w:pPr>
+              <w:spacing w:line="240" w:lineRule="auto"/>
+            </w:pPr>
+            <w:r>
+              <w:rPr>
+                <w:rFonts w:ascii="Courier New" w:hAnsi="Courier New" w:eastAsia="Courier New"/>
+                <w:sz w:val="15"/>
+              </w:rPr>
+              <w:t>fi</w:t>
+            </w:r>
+          </w:p>
+          <w:p>
+            <w:pPr>
+              <w:spacing w:line="240" w:lineRule="auto"/>
+            </w:pPr>
+            <w:r>
+              <w:rPr>
+                <w:rFonts w:ascii="Courier New" w:hAnsi="Courier New" w:eastAsia="Courier New"/>
+                <w:sz w:val="15"/>
+              </w:rPr>
+              <w:t xml:space="preserve"> </w:t>
+            </w:r>
+          </w:p>
+          <w:p>
+            <w:pPr>
+              <w:spacing w:line="240" w:lineRule="auto"/>
+            </w:pPr>
+            <w:r>
+              <w:rPr>
+                <w:rFonts w:ascii="Courier New" w:hAnsi="Courier New" w:eastAsia="Courier New"/>
+                <w:sz w:val="15"/>
+              </w:rPr>
+              <w:t>if [[ "$1" == *.sql ]]; then</w:t>
+            </w:r>
+          </w:p>
+          <w:p>
+            <w:pPr>
+              <w:spacing w:line="240" w:lineRule="auto"/>
+            </w:pPr>
+            <w:r>
+              <w:rPr>
+                <w:rFonts w:ascii="Courier New" w:hAnsi="Courier New" w:eastAsia="Courier New"/>
+                <w:sz w:val="15"/>
+              </w:rPr>
+              <w:t xml:space="preserve">    f="$1"; shift</w:t>
+            </w:r>
+          </w:p>
+          <w:p>
+            <w:pPr>
+              <w:spacing w:line="240" w:lineRule="auto"/>
+            </w:pPr>
+            <w:r>
+              <w:rPr>
+                <w:rFonts w:ascii="Courier New" w:hAnsi="Courier New" w:eastAsia="Courier New"/>
+                <w:sz w:val="15"/>
+              </w:rPr>
+              <w:t xml:space="preserve">    run "$f" "$@"</w:t>
+            </w:r>
+          </w:p>
+          <w:p>
+            <w:pPr>
+              <w:spacing w:line="240" w:lineRule="auto"/>
+            </w:pPr>
+            <w:r>
+              <w:rPr>
+                <w:rFonts w:ascii="Courier New" w:hAnsi="Courier New" w:eastAsia="Courier New"/>
+                <w:sz w:val="15"/>
+              </w:rPr>
+              <w:t xml:space="preserve">    exit 0</w:t>
+            </w:r>
+          </w:p>
+          <w:p>
+            <w:pPr>
+              <w:spacing w:line="240" w:lineRule="auto"/>
+            </w:pPr>
+            <w:r>
+              <w:rPr>
+                <w:rFonts w:ascii="Courier New" w:hAnsi="Courier New" w:eastAsia="Courier New"/>
+                <w:sz w:val="15"/>
+              </w:rPr>
+              <w:t>fi</w:t>
+            </w:r>
+          </w:p>
+          <w:p>
+            <w:pPr>
+              <w:spacing w:line="240" w:lineRule="auto"/>
+            </w:pPr>
+            <w:r>
+              <w:rPr>
+                <w:rFonts w:ascii="Courier New" w:hAnsi="Courier New" w:eastAsia="Courier New"/>
+                <w:sz w:val="15"/>
+              </w:rPr>
+              <w:t xml:space="preserve"> </w:t>
+            </w:r>
+          </w:p>
+          <w:p>
+            <w:pPr>
+              <w:spacing w:line="240" w:lineRule="auto"/>
+            </w:pPr>
+            <w:r>
+              <w:rPr>
+                <w:rFonts w:ascii="Courier New" w:hAnsi="Courier New" w:eastAsia="Courier New"/>
+                <w:sz w:val="15"/>
+              </w:rPr>
+              <w:t>case "$1" in</w:t>
+            </w:r>
+          </w:p>
+          <w:p>
+            <w:pPr>
+              <w:spacing w:line="240" w:lineRule="auto"/>
+            </w:pPr>
+            <w:r>
+              <w:rPr>
+                <w:rFonts w:ascii="Courier New" w:hAnsi="Courier New" w:eastAsia="Courier New"/>
+                <w:sz w:val="15"/>
+              </w:rPr>
+              <w:t xml:space="preserve">    # ------------------------------ ЛР1 ------------------------------</w:t>
+            </w:r>
+          </w:p>
+          <w:p>
+            <w:pPr>
+              <w:spacing w:line="240" w:lineRule="auto"/>
+            </w:pPr>
+            <w:r>
+              <w:rPr>
+                <w:rFonts w:ascii="Courier New" w:hAnsi="Courier New" w:eastAsia="Courier New"/>
+                <w:sz w:val="15"/>
+              </w:rPr>
+              <w:t xml:space="preserve">    db)</w:t>
+            </w:r>
+          </w:p>
+          <w:p>
+            <w:pPr>
+              <w:spacing w:line="240" w:lineRule="auto"/>
+            </w:pPr>
+            <w:r>
+              <w:rPr>
+                <w:rFonts w:ascii="Courier New" w:hAnsi="Courier New" w:eastAsia="Courier New"/>
+                <w:sz w:val="15"/>
+              </w:rPr>
+              <w:t xml:space="preserve">        run_pg DATA/create_DB</w:t>
+            </w:r>
+          </w:p>
+          <w:p>
+            <w:pPr>
+              <w:spacing w:line="240" w:lineRule="auto"/>
+            </w:pPr>
+            <w:r>
+              <w:rPr>
+                <w:rFonts w:ascii="Courier New" w:hAnsi="Courier New" w:eastAsia="Courier New"/>
+                <w:sz w:val="15"/>
+              </w:rPr>
+              <w:t xml:space="preserve">        run DATA/create_tables &gt;/dev/null</w:t>
+            </w:r>
+          </w:p>
+          <w:p>
+            <w:pPr>
+              <w:spacing w:line="240" w:lineRule="auto"/>
+            </w:pPr>
+            <w:r>
+              <w:rPr>
+                <w:rFonts w:ascii="Courier New" w:hAnsi="Courier New" w:eastAsia="Courier New"/>
+                <w:sz w:val="15"/>
+              </w:rPr>
+              <w:t xml:space="preserve">        run DATA/load_data</w:t>
+            </w:r>
+          </w:p>
+          <w:p>
+            <w:pPr>
+              <w:spacing w:line="240" w:lineRule="auto"/>
+            </w:pPr>
+            <w:r>
+              <w:rPr>
+                <w:rFonts w:ascii="Courier New" w:hAnsi="Courier New" w:eastAsia="Courier New"/>
+                <w:sz w:val="15"/>
+              </w:rPr>
+              <w:t xml:space="preserve">        ;;</w:t>
+            </w:r>
+          </w:p>
+          <w:p>
+            <w:pPr>
+              <w:spacing w:line="240" w:lineRule="auto"/>
+            </w:pPr>
+            <w:r>
+              <w:rPr>
+                <w:rFonts w:ascii="Courier New" w:hAnsi="Courier New" w:eastAsia="Courier New"/>
+                <w:sz w:val="15"/>
+              </w:rPr>
+              <w:t xml:space="preserve">    counts) run helper/counts.sql ;;</w:t>
+            </w:r>
+          </w:p>
+          <w:p>
+            <w:pPr>
+              <w:spacing w:line="240" w:lineRule="auto"/>
+            </w:pPr>
+            <w:r>
+              <w:rPr>
+                <w:rFonts w:ascii="Courier New" w:hAnsi="Courier New" w:eastAsia="Courier New"/>
+                <w:sz w:val="15"/>
+              </w:rPr>
+              <w:t xml:space="preserve">    v20|v22)</w:t>
+            </w:r>
+          </w:p>
+          <w:p>
+            <w:pPr>
+              <w:spacing w:line="240" w:lineRule="auto"/>
+            </w:pPr>
+            <w:r>
+              <w:rPr>
+                <w:rFonts w:ascii="Courier New" w:hAnsi="Courier New" w:eastAsia="Courier New"/>
+                <w:sz w:val="15"/>
+              </w:rPr>
+              <w:t xml:space="preserve">        need_task "$2"</w:t>
+            </w:r>
+          </w:p>
+          <w:p>
+            <w:pPr>
+              <w:spacing w:line="240" w:lineRule="auto"/>
+            </w:pPr>
+            <w:r>
+              <w:rPr>
+                <w:rFonts w:ascii="Courier New" w:hAnsi="Courier New" w:eastAsia="Courier New"/>
+                <w:sz w:val="15"/>
+              </w:rPr>
+              <w:t xml:space="preserve">        run "tasks/$1_task$2.sql" "$3" "$4" "$5"</w:t>
+            </w:r>
+          </w:p>
+          <w:p>
+            <w:pPr>
+              <w:spacing w:line="240" w:lineRule="auto"/>
+            </w:pPr>
+            <w:r>
+              <w:rPr>
+                <w:rFonts w:ascii="Courier New" w:hAnsi="Courier New" w:eastAsia="Courier New"/>
+                <w:sz w:val="15"/>
+              </w:rPr>
+              <w:t xml:space="preserve">        ;;</w:t>
+            </w:r>
+          </w:p>
+          <w:p>
+            <w:pPr>
+              <w:spacing w:line="240" w:lineRule="auto"/>
+            </w:pPr>
+            <w:r>
+              <w:rPr>
+                <w:rFonts w:ascii="Courier New" w:hAnsi="Courier New" w:eastAsia="Courier New"/>
+                <w:sz w:val="15"/>
+              </w:rPr>
+              <w:t xml:space="preserve">    all)</w:t>
+            </w:r>
+          </w:p>
+          <w:p>
+            <w:pPr>
+              <w:spacing w:line="240" w:lineRule="auto"/>
+            </w:pPr>
+            <w:r>
+              <w:rPr>
+                <w:rFonts w:ascii="Courier New" w:hAnsi="Courier New" w:eastAsia="Courier New"/>
+                <w:sz w:val="15"/>
+              </w:rPr>
+              <w:t xml:space="preserve">        for t in v20_task1 v20_task2 v22_task1 v22_task2; do</w:t>
+            </w:r>
+          </w:p>
+          <w:p>
+            <w:pPr>
+              <w:spacing w:line="240" w:lineRule="auto"/>
+            </w:pPr>
+            <w:r>
+              <w:rPr>
+                <w:rFonts w:ascii="Courier New" w:hAnsi="Courier New" w:eastAsia="Courier New"/>
+                <w:sz w:val="15"/>
+              </w:rPr>
+              <w:t xml:space="preserve">            run "tasks/$t.sql"</w:t>
+            </w:r>
+          </w:p>
+          <w:p>
+            <w:pPr>
+              <w:spacing w:line="240" w:lineRule="auto"/>
+            </w:pPr>
+            <w:r>
+              <w:rPr>
+                <w:rFonts w:ascii="Courier New" w:hAnsi="Courier New" w:eastAsia="Courier New"/>
+                <w:sz w:val="15"/>
+              </w:rPr>
+              <w:t xml:space="preserve">        done</w:t>
+            </w:r>
+          </w:p>
+          <w:p>
+            <w:pPr>
+              <w:spacing w:line="240" w:lineRule="auto"/>
+            </w:pPr>
+            <w:r>
+              <w:rPr>
+                <w:rFonts w:ascii="Courier New" w:hAnsi="Courier New" w:eastAsia="Courier New"/>
+                <w:sz w:val="15"/>
+              </w:rPr>
+              <w:t xml:space="preserve">        ;;</w:t>
+            </w:r>
+          </w:p>
+          <w:p>
+            <w:pPr>
+              <w:spacing w:line="240" w:lineRule="auto"/>
+            </w:pPr>
+            <w:r>
+              <w:rPr>
+                <w:rFonts w:ascii="Courier New" w:hAnsi="Courier New" w:eastAsia="Courier New"/>
+                <w:sz w:val="15"/>
+              </w:rPr>
+              <w:t xml:space="preserve"> </w:t>
+            </w:r>
+          </w:p>
+          <w:p>
+            <w:pPr>
+              <w:spacing w:line="240" w:lineRule="auto"/>
+            </w:pPr>
+            <w:r>
+              <w:rPr>
+                <w:rFonts w:ascii="Courier New" w:hAnsi="Courier New" w:eastAsia="Courier New"/>
+                <w:sz w:val="15"/>
+              </w:rPr>
+              <w:t xml:space="preserve">    lr1)</w:t>
+            </w:r>
+          </w:p>
+          <w:p>
+            <w:pPr>
+              <w:spacing w:line="240" w:lineRule="auto"/>
+            </w:pPr>
+            <w:r>
+              <w:rPr>
+                <w:rFonts w:ascii="Courier New" w:hAnsi="Courier New" w:eastAsia="Courier New"/>
+                <w:sz w:val="15"/>
+              </w:rPr>
+              <w:t xml:space="preserve">        case "$2" in</w:t>
+            </w:r>
+          </w:p>
+          <w:p>
+            <w:pPr>
+              <w:spacing w:line="240" w:lineRule="auto"/>
+            </w:pPr>
+            <w:r>
+              <w:rPr>
+                <w:rFonts w:ascii="Courier New" w:hAnsi="Courier New" w:eastAsia="Courier New"/>
+                <w:sz w:val="15"/>
+              </w:rPr>
+              <w:t xml:space="preserve">            lan)    powershell -ExecutionPolicy Bypass -File lab1/setup_lan.ps1 ;;</w:t>
+            </w:r>
+          </w:p>
+          <w:p>
+            <w:pPr>
+              <w:spacing w:line="240" w:lineRule="auto"/>
+            </w:pPr>
+            <w:r>
+              <w:rPr>
+                <w:rFonts w:ascii="Courier New" w:hAnsi="Courier New" w:eastAsia="Courier New"/>
+                <w:sz w:val="15"/>
+              </w:rPr>
+              <w:t xml:space="preserve">            client)</w:t>
+            </w:r>
+          </w:p>
+          <w:p>
+            <w:pPr>
+              <w:spacing w:line="240" w:lineRule="auto"/>
+            </w:pPr>
+            <w:r>
+              <w:rPr>
+                <w:rFonts w:ascii="Courier New" w:hAnsi="Courier New" w:eastAsia="Courier New"/>
+                <w:sz w:val="15"/>
+              </w:rPr>
+              <w:t xml:space="preserve">                if [ -z "$3" ]; then echo "Использование: ./h lr1 client сценарий [a1 a2 a3]"; exit 1; fi</w:t>
+            </w:r>
+          </w:p>
+          <w:p>
+            <w:pPr>
+              <w:spacing w:line="240" w:lineRule="auto"/>
+            </w:pPr>
+            <w:r>
+              <w:rPr>
+                <w:rFonts w:ascii="Courier New" w:hAnsi="Courier New" w:eastAsia="Courier New"/>
+                <w:sz w:val="15"/>
+              </w:rPr>
+              <w:t xml:space="preserve">                bat lab1/s_lan.bat "$(cygpath -w "$3")" "$4" "$5" "$6"</w:t>
+            </w:r>
+          </w:p>
+          <w:p>
+            <w:pPr>
+              <w:spacing w:line="240" w:lineRule="auto"/>
+            </w:pPr>
+            <w:r>
+              <w:rPr>
+                <w:rFonts w:ascii="Courier New" w:hAnsi="Courier New" w:eastAsia="Courier New"/>
+                <w:sz w:val="15"/>
+              </w:rPr>
+              <w:t xml:space="preserve">                ;;</w:t>
+            </w:r>
+          </w:p>
+          <w:p>
+            <w:pPr>
+              <w:spacing w:line="240" w:lineRule="auto"/>
+            </w:pPr>
+            <w:r>
+              <w:rPr>
+                <w:rFonts w:ascii="Courier New" w:hAnsi="Courier New" w:eastAsia="Courier New"/>
+                <w:sz w:val="15"/>
+              </w:rPr>
+              <w:t xml:space="preserve">            *) echo "ОШИБКА: ./h lr1 lan|client" ;;</w:t>
+            </w:r>
+          </w:p>
+          <w:p>
+            <w:pPr>
+              <w:spacing w:line="240" w:lineRule="auto"/>
+            </w:pPr>
+            <w:r>
+              <w:rPr>
+                <w:rFonts w:ascii="Courier New" w:hAnsi="Courier New" w:eastAsia="Courier New"/>
+                <w:sz w:val="15"/>
+              </w:rPr>
+              <w:t xml:space="preserve">        esac</w:t>
+            </w:r>
+          </w:p>
+          <w:p>
+            <w:pPr>
+              <w:spacing w:line="240" w:lineRule="auto"/>
+            </w:pPr>
+            <w:r>
+              <w:rPr>
+                <w:rFonts w:ascii="Courier New" w:hAnsi="Courier New" w:eastAsia="Courier New"/>
+                <w:sz w:val="15"/>
+              </w:rPr>
+              <w:t xml:space="preserve">        ;;</w:t>
+            </w:r>
+          </w:p>
+          <w:p>
+            <w:pPr>
+              <w:spacing w:line="240" w:lineRule="auto"/>
+            </w:pPr>
+            <w:r>
+              <w:rPr>
+                <w:rFonts w:ascii="Courier New" w:hAnsi="Courier New" w:eastAsia="Courier New"/>
+                <w:sz w:val="15"/>
+              </w:rPr>
+              <w:t xml:space="preserve"> </w:t>
+            </w:r>
+          </w:p>
+          <w:p>
+            <w:pPr>
+              <w:spacing w:line="240" w:lineRule="auto"/>
+            </w:pPr>
+            <w:r>
+              <w:rPr>
+                <w:rFonts w:ascii="Courier New" w:hAnsi="Courier New" w:eastAsia="Courier New"/>
+                <w:sz w:val="15"/>
+              </w:rPr>
+              <w:t xml:space="preserve">    # ------------------------------ ЛР2 ------------------------------</w:t>
+            </w:r>
+          </w:p>
+          <w:p>
+            <w:pPr>
+              <w:spacing w:line="240" w:lineRule="auto"/>
+            </w:pPr>
+            <w:r>
+              <w:rPr>
+                <w:rFonts w:ascii="Courier New" w:hAnsi="Courier New" w:eastAsia="Courier New"/>
+                <w:sz w:val="15"/>
+              </w:rPr>
+              <w:t xml:space="preserve">    lr2)</w:t>
+            </w:r>
+          </w:p>
+          <w:p>
+            <w:pPr>
+              <w:spacing w:line="240" w:lineRule="auto"/>
+            </w:pPr>
+            <w:r>
+              <w:rPr>
+                <w:rFonts w:ascii="Courier New" w:hAnsi="Courier New" w:eastAsia="Courier New"/>
+                <w:sz w:val="15"/>
+              </w:rPr>
+              <w:t xml:space="preserve">        case "$2" in</w:t>
+            </w:r>
+          </w:p>
+          <w:p>
+            <w:pPr>
+              <w:spacing w:line="240" w:lineRule="auto"/>
+            </w:pPr>
+            <w:r>
+              <w:rPr>
+                <w:rFonts w:ascii="Courier New" w:hAnsi="Courier New" w:eastAsia="Courier New"/>
+                <w:sz w:val="15"/>
+              </w:rPr>
+              <w:t xml:space="preserve">            gen)      run lab2/add_data.sql "$3" ;;</w:t>
+            </w:r>
+          </w:p>
+          <w:p>
+            <w:pPr>
+              <w:spacing w:line="240" w:lineRule="auto"/>
+            </w:pPr>
+            <w:r>
+              <w:rPr>
+                <w:rFonts w:ascii="Courier New" w:hAnsi="Courier New" w:eastAsia="Courier New"/>
+                <w:sz w:val="15"/>
+              </w:rPr>
+              <w:t xml:space="preserve">            restore)  run lab2/restore_lr1.sql ;;</w:t>
+            </w:r>
+          </w:p>
+          <w:p>
+            <w:pPr>
+              <w:spacing w:line="240" w:lineRule="auto"/>
+            </w:pPr>
+            <w:r>
+              <w:rPr>
+                <w:rFonts w:ascii="Courier New" w:hAnsi="Courier New" w:eastAsia="Courier New"/>
+                <w:sz w:val="15"/>
+              </w:rPr>
+              <w:t xml:space="preserve">            tbs)      run lab2/tablespace.sql "$3" ;;</w:t>
+            </w:r>
+          </w:p>
+          <w:p>
+            <w:pPr>
+              <w:spacing w:line="240" w:lineRule="auto"/>
+            </w:pPr>
+            <w:r>
+              <w:rPr>
+                <w:rFonts w:ascii="Courier New" w:hAnsi="Courier New" w:eastAsia="Courier New"/>
+                <w:sz w:val="15"/>
+              </w:rPr>
+              <w:t xml:space="preserve">            time)     need_variant "$3"; run lab2/time_current.sql "$3" ;;</w:t>
+            </w:r>
+          </w:p>
+          <w:p>
+            <w:pPr>
+              <w:spacing w:line="240" w:lineRule="auto"/>
+            </w:pPr>
+            <w:r>
+              <w:rPr>
+                <w:rFonts w:ascii="Courier New" w:hAnsi="Courier New" w:eastAsia="Courier New"/>
+                <w:sz w:val="15"/>
+              </w:rPr>
+              <w:t xml:space="preserve">            timing)   need_variant "$3"; run lab2/time_timing.sql "$3" ;;</w:t>
+            </w:r>
+          </w:p>
+          <w:p>
+            <w:pPr>
+              <w:spacing w:line="240" w:lineRule="auto"/>
+            </w:pPr>
+            <w:r>
+              <w:rPr>
+                <w:rFonts w:ascii="Courier New" w:hAnsi="Courier New" w:eastAsia="Courier New"/>
+                <w:sz w:val="15"/>
+              </w:rPr>
+              <w:t xml:space="preserve">            idx)      need_variant "$3"; run lab2/idx_names.sql "$3" ;;</w:t>
+            </w:r>
+          </w:p>
+          <w:p>
+            <w:pPr>
+              <w:spacing w:line="240" w:lineRule="auto"/>
+            </w:pPr>
+            <w:r>
+              <w:rPr>
+                <w:rFonts w:ascii="Courier New" w:hAnsi="Courier New" w:eastAsia="Courier New"/>
+                <w:sz w:val="15"/>
+              </w:rPr>
+              <w:t xml:space="preserve">            idx1)     need_variant "$3"; run lab2/idx_1.sql "$3" "$4" ;;</w:t>
+            </w:r>
+          </w:p>
+          <w:p>
+            <w:pPr>
+              <w:spacing w:line="240" w:lineRule="auto"/>
+            </w:pPr>
+            <w:r>
+              <w:rPr>
+                <w:rFonts w:ascii="Courier New" w:hAnsi="Courier New" w:eastAsia="Courier New"/>
+                <w:sz w:val="15"/>
+              </w:rPr>
+              <w:t xml:space="preserve">            idx0)     need_variant "$3"; run lab2/idx_0.sql "$3" ;;</w:t>
+            </w:r>
+          </w:p>
+          <w:p>
+            <w:pPr>
+              <w:spacing w:line="240" w:lineRule="auto"/>
+            </w:pPr>
+            <w:r>
+              <w:rPr>
+                <w:rFonts w:ascii="Courier New" w:hAnsi="Courier New" w:eastAsia="Courier New"/>
+                <w:sz w:val="15"/>
+              </w:rPr>
+              <w:t xml:space="preserve">            pk1)      need_variant "$3"; run lab2/create_ref0.sql "$3" ;;</w:t>
+            </w:r>
+          </w:p>
+          <w:p>
+            <w:pPr>
+              <w:spacing w:line="240" w:lineRule="auto"/>
+            </w:pPr>
+            <w:r>
+              <w:rPr>
+                <w:rFonts w:ascii="Courier New" w:hAnsi="Courier New" w:eastAsia="Courier New"/>
+                <w:sz w:val="15"/>
+              </w:rPr>
+              <w:t xml:space="preserve">            pk0)      need_variant "$3"; run lab2/create_ref1.sql "$3" ;;</w:t>
+            </w:r>
+          </w:p>
+          <w:p>
+            <w:pPr>
+              <w:spacing w:line="240" w:lineRule="auto"/>
+            </w:pPr>
+            <w:r>
+              <w:rPr>
+                <w:rFonts w:ascii="Courier New" w:hAnsi="Courier New" w:eastAsia="Courier New"/>
+                <w:sz w:val="15"/>
+              </w:rPr>
+              <w:t xml:space="preserve">            copy)     need_variant "$3"; run lab2/copy_ref.sql "$3" ;;</w:t>
+            </w:r>
+          </w:p>
+          <w:p>
+            <w:pPr>
+              <w:spacing w:line="240" w:lineRule="auto"/>
+            </w:pPr>
+            <w:r>
+              <w:rPr>
+                <w:rFonts w:ascii="Courier New" w:hAnsi="Courier New" w:eastAsia="Courier New"/>
+                <w:sz w:val="15"/>
+              </w:rPr>
+              <w:t xml:space="preserve">            explain)  need_variant "$3"; run lab2/explain.sql "$3" "$4" ;;</w:t>
+            </w:r>
+          </w:p>
+          <w:p>
+            <w:pPr>
+              <w:spacing w:line="240" w:lineRule="auto"/>
+            </w:pPr>
+            <w:r>
+              <w:rPr>
+                <w:rFonts w:ascii="Courier New" w:hAnsi="Courier New" w:eastAsia="Courier New"/>
+                <w:sz w:val="15"/>
+              </w:rPr>
+              <w:t xml:space="preserve">            measure)  need_variant "$3"; run lab2/measure.sql "$3" "$4"</w:t>
+            </w:r>
+          </w:p>
+          <w:p>
+            <w:pPr>
+              <w:spacing w:line="240" w:lineRule="auto"/>
+            </w:pPr>
+            <w:r>
+              <w:rPr>
+                <w:rFonts w:ascii="Courier New" w:hAnsi="Courier New" w:eastAsia="Courier New"/>
+                <w:sz w:val="15"/>
+              </w:rPr>
+              <w:t xml:space="preserve">                      cat "results/lr2_v$3_results.txt" ;;</w:t>
+            </w:r>
+          </w:p>
+          <w:p>
+            <w:pPr>
+              <w:spacing w:line="240" w:lineRule="auto"/>
+            </w:pPr>
+            <w:r>
+              <w:rPr>
+                <w:rFonts w:ascii="Courier New" w:hAnsi="Courier New" w:eastAsia="Courier New"/>
+                <w:sz w:val="15"/>
+              </w:rPr>
+              <w:t xml:space="preserve">            results)  need_variant "$3"; cat "results/lr2_v$3_results.txt" ;;</w:t>
+            </w:r>
+          </w:p>
+          <w:p>
+            <w:pPr>
+              <w:spacing w:line="240" w:lineRule="auto"/>
+            </w:pPr>
+            <w:r>
+              <w:rPr>
+                <w:rFonts w:ascii="Courier New" w:hAnsi="Courier New" w:eastAsia="Courier New"/>
+                <w:sz w:val="15"/>
+              </w:rPr>
+              <w:t xml:space="preserve">            *) echo "ОШИБКА: ./h lr2 gen|restore|tbs|time|timing|idx|idx1|idx0|pk1|pk0|copy|explain|measure|results" ;;</w:t>
+            </w:r>
+          </w:p>
+          <w:p>
+            <w:pPr>
+              <w:spacing w:line="240" w:lineRule="auto"/>
+            </w:pPr>
+            <w:r>
+              <w:rPr>
+                <w:rFonts w:ascii="Courier New" w:hAnsi="Courier New" w:eastAsia="Courier New"/>
+                <w:sz w:val="15"/>
+              </w:rPr>
+              <w:t xml:space="preserve">        esac</w:t>
+            </w:r>
+          </w:p>
+          <w:p>
+            <w:pPr>
+              <w:spacing w:line="240" w:lineRule="auto"/>
+            </w:pPr>
+            <w:r>
+              <w:rPr>
+                <w:rFonts w:ascii="Courier New" w:hAnsi="Courier New" w:eastAsia="Courier New"/>
+                <w:sz w:val="15"/>
+              </w:rPr>
+              <w:t xml:space="preserve">        ;;</w:t>
+            </w:r>
+          </w:p>
+          <w:p>
+            <w:pPr>
+              <w:spacing w:line="240" w:lineRule="auto"/>
+            </w:pPr>
+            <w:r>
+              <w:rPr>
+                <w:rFonts w:ascii="Courier New" w:hAnsi="Courier New" w:eastAsia="Courier New"/>
+                <w:sz w:val="15"/>
+              </w:rPr>
+              <w:t xml:space="preserve"> </w:t>
+            </w:r>
+          </w:p>
+          <w:p>
+            <w:pPr>
+              <w:spacing w:line="240" w:lineRule="auto"/>
+            </w:pPr>
+            <w:r>
+              <w:rPr>
+                <w:rFonts w:ascii="Courier New" w:hAnsi="Courier New" w:eastAsia="Courier New"/>
+                <w:sz w:val="15"/>
+              </w:rPr>
+              <w:t xml:space="preserve">    # ------------------------------ ЛР3 ------------------------------</w:t>
+            </w:r>
+          </w:p>
+          <w:p>
+            <w:pPr>
+              <w:spacing w:line="240" w:lineRule="auto"/>
+            </w:pPr>
+            <w:r>
+              <w:rPr>
+                <w:rFonts w:ascii="Courier New" w:hAnsi="Courier New" w:eastAsia="Courier New"/>
+                <w:sz w:val="15"/>
+              </w:rPr>
+              <w:t xml:space="preserve">    lr3)</w:t>
+            </w:r>
+          </w:p>
+          <w:p>
+            <w:pPr>
+              <w:spacing w:line="240" w:lineRule="auto"/>
+            </w:pPr>
+            <w:r>
+              <w:rPr>
+                <w:rFonts w:ascii="Courier New" w:hAnsi="Courier New" w:eastAsia="Courier New"/>
+                <w:sz w:val="15"/>
+              </w:rPr>
+              <w:t xml:space="preserve">        case "$2" in</w:t>
+            </w:r>
+          </w:p>
+          <w:p>
+            <w:pPr>
+              <w:spacing w:line="240" w:lineRule="auto"/>
+            </w:pPr>
+            <w:r>
+              <w:rPr>
+                <w:rFonts w:ascii="Courier New" w:hAnsi="Courier New" w:eastAsia="Courier New"/>
+                <w:sz w:val="15"/>
+              </w:rPr>
+              <w:t xml:space="preserve">            cmplx) run lab3/cmplx.sql ;;</w:t>
+            </w:r>
+          </w:p>
+          <w:p>
+            <w:pPr>
+              <w:spacing w:line="240" w:lineRule="auto"/>
+            </w:pPr>
+            <w:r>
+              <w:rPr>
+                <w:rFonts w:ascii="Courier New" w:hAnsi="Courier New" w:eastAsia="Courier New"/>
+                <w:sz w:val="15"/>
+              </w:rPr>
+              <w:t xml:space="preserve">            20)    run lab3/v20_vector3.sql ;;</w:t>
+            </w:r>
+          </w:p>
+          <w:p>
+            <w:pPr>
+              <w:spacing w:line="240" w:lineRule="auto"/>
+            </w:pPr>
+            <w:r>
+              <w:rPr>
+                <w:rFonts w:ascii="Courier New" w:hAnsi="Courier New" w:eastAsia="Courier New"/>
+                <w:sz w:val="15"/>
+              </w:rPr>
+              <w:t xml:space="preserve">            22)    run lab3/v22_rational.sql ;;</w:t>
+            </w:r>
+          </w:p>
+          <w:p>
+            <w:pPr>
+              <w:spacing w:line="240" w:lineRule="auto"/>
+            </w:pPr>
+            <w:r>
+              <w:rPr>
+                <w:rFonts w:ascii="Courier New" w:hAnsi="Courier New" w:eastAsia="Courier New"/>
+                <w:sz w:val="15"/>
+              </w:rPr>
+              <w:t xml:space="preserve">            *) echo "ОШИБКА: ./h lr3 cmplx|20|22" ;;</w:t>
+            </w:r>
+          </w:p>
+          <w:p>
+            <w:pPr>
+              <w:spacing w:line="240" w:lineRule="auto"/>
+            </w:pPr>
+            <w:r>
+              <w:rPr>
+                <w:rFonts w:ascii="Courier New" w:hAnsi="Courier New" w:eastAsia="Courier New"/>
+                <w:sz w:val="15"/>
+              </w:rPr>
+              <w:t xml:space="preserve">        esac</w:t>
+            </w:r>
+          </w:p>
+          <w:p>
+            <w:pPr>
+              <w:spacing w:line="240" w:lineRule="auto"/>
+            </w:pPr>
+            <w:r>
+              <w:rPr>
+                <w:rFonts w:ascii="Courier New" w:hAnsi="Courier New" w:eastAsia="Courier New"/>
+                <w:sz w:val="15"/>
+              </w:rPr>
+              <w:t xml:space="preserve">        ;;</w:t>
+            </w:r>
+          </w:p>
+          <w:p>
+            <w:pPr>
+              <w:spacing w:line="240" w:lineRule="auto"/>
+            </w:pPr>
+            <w:r>
+              <w:rPr>
+                <w:rFonts w:ascii="Courier New" w:hAnsi="Courier New" w:eastAsia="Courier New"/>
+                <w:sz w:val="15"/>
+              </w:rPr>
+              <w:t xml:space="preserve"> </w:t>
+            </w:r>
+          </w:p>
+          <w:p>
+            <w:pPr>
+              <w:spacing w:line="240" w:lineRule="auto"/>
+            </w:pPr>
+            <w:r>
+              <w:rPr>
+                <w:rFonts w:ascii="Courier New" w:hAnsi="Courier New" w:eastAsia="Courier New"/>
+                <w:sz w:val="15"/>
+              </w:rPr>
+              <w:t xml:space="preserve">    # ------------------------------ ЛР4 ------------------------------</w:t>
+            </w:r>
+          </w:p>
+          <w:p>
+            <w:pPr>
+              <w:spacing w:line="240" w:lineRule="auto"/>
+            </w:pPr>
+            <w:r>
+              <w:rPr>
+                <w:rFonts w:ascii="Courier New" w:hAnsi="Courier New" w:eastAsia="Courier New"/>
+                <w:sz w:val="15"/>
+              </w:rPr>
+              <w:t xml:space="preserve">    lr4)</w:t>
+            </w:r>
+          </w:p>
+          <w:p>
+            <w:pPr>
+              <w:spacing w:line="240" w:lineRule="auto"/>
+            </w:pPr>
+            <w:r>
+              <w:rPr>
+                <w:rFonts w:ascii="Courier New" w:hAnsi="Courier New" w:eastAsia="Courier New"/>
+                <w:sz w:val="15"/>
+              </w:rPr>
+              <w:t xml:space="preserve">        case "$2" in</w:t>
+            </w:r>
+          </w:p>
+          <w:p>
+            <w:pPr>
+              <w:spacing w:line="240" w:lineRule="auto"/>
+            </w:pPr>
+            <w:r>
+              <w:rPr>
+                <w:rFonts w:ascii="Courier New" w:hAnsi="Courier New" w:eastAsia="Courier New"/>
+                <w:sz w:val="15"/>
+              </w:rPr>
+              <w:t xml:space="preserve">            all)</w:t>
+            </w:r>
+          </w:p>
+          <w:p>
+            <w:pPr>
+              <w:spacing w:line="240" w:lineRule="auto"/>
+            </w:pPr>
+            <w:r>
+              <w:rPr>
+                <w:rFonts w:ascii="Courier New" w:hAnsi="Courier New" w:eastAsia="Courier New"/>
+                <w:sz w:val="15"/>
+              </w:rPr>
+              <w:t xml:space="preserve">                v=${3:-20}; need_variant "$v"</w:t>
+            </w:r>
+          </w:p>
+          <w:p>
+            <w:pPr>
+              <w:spacing w:line="240" w:lineRule="auto"/>
+            </w:pPr>
+            <w:r>
+              <w:rPr>
+                <w:rFonts w:ascii="Courier New" w:hAnsi="Courier New" w:eastAsia="Courier New"/>
+                <w:sz w:val="15"/>
+              </w:rPr>
+              <w:t xml:space="preserve">                bat lab4/run_all.bat "$v" 2&gt;&amp;1 | perl helper/fixenc.pl | tee "results/lr4_v${v}_protocol.txt"</w:t>
+            </w:r>
+          </w:p>
+          <w:p>
+            <w:pPr>
+              <w:spacing w:line="240" w:lineRule="auto"/>
+            </w:pPr>
+            <w:r>
+              <w:rPr>
+                <w:rFonts w:ascii="Courier New" w:hAnsi="Courier New" w:eastAsia="Courier New"/>
+                <w:sz w:val="15"/>
+              </w:rPr>
+              <w:t xml:space="preserve">                ;;</w:t>
+            </w:r>
+          </w:p>
+          <w:p>
+            <w:pPr>
+              <w:spacing w:line="240" w:lineRule="auto"/>
+            </w:pPr>
+            <w:r>
+              <w:rPr>
+                <w:rFonts w:ascii="Courier New" w:hAnsi="Courier New" w:eastAsia="Courier New"/>
+                <w:sz w:val="15"/>
+              </w:rPr>
+              <w:t xml:space="preserve">            base)  bat lab4/create_base.bat 2&gt;&amp;1 | perl helper/fixenc.pl ;;</w:t>
+            </w:r>
+          </w:p>
+          <w:p>
+            <w:pPr>
+              <w:spacing w:line="240" w:lineRule="auto"/>
+            </w:pPr>
+            <w:r>
+              <w:rPr>
+                <w:rFonts w:ascii="Courier New" w:hAnsi="Courier New" w:eastAsia="Courier New"/>
+                <w:sz w:val="15"/>
+              </w:rPr>
+              <w:t xml:space="preserve">            tasks)</w:t>
+            </w:r>
+          </w:p>
+          <w:p>
+            <w:pPr>
+              <w:spacing w:line="240" w:lineRule="auto"/>
+            </w:pPr>
+            <w:r>
+              <w:rPr>
+                <w:rFonts w:ascii="Courier New" w:hAnsi="Courier New" w:eastAsia="Courier New"/>
+                <w:sz w:val="15"/>
+              </w:rPr>
+              <w:t xml:space="preserve">                if [ -z "$3" ]; then echo "Использование: ./h lr4 tasks N [база]"; exit 1; fi</w:t>
+            </w:r>
+          </w:p>
+          <w:p>
+            <w:pPr>
+              <w:spacing w:line="240" w:lineRule="auto"/>
+            </w:pPr>
+            <w:r>
+              <w:rPr>
+                <w:rFonts w:ascii="Courier New" w:hAnsi="Courier New" w:eastAsia="Courier New"/>
+                <w:sz w:val="15"/>
+              </w:rPr>
+              <w:t xml:space="preserve">                bat lab4/tasks.bat "$3" "$4"</w:t>
+            </w:r>
+          </w:p>
+          <w:p>
+            <w:pPr>
+              <w:spacing w:line="240" w:lineRule="auto"/>
+            </w:pPr>
+            <w:r>
+              <w:rPr>
+                <w:rFonts w:ascii="Courier New" w:hAnsi="Courier New" w:eastAsia="Courier New"/>
+                <w:sz w:val="15"/>
+              </w:rPr>
+              <w:t xml:space="preserve">                ;;</w:t>
+            </w:r>
+          </w:p>
+          <w:p>
+            <w:pPr>
+              <w:spacing w:line="240" w:lineRule="auto"/>
+            </w:pPr>
+            <w:r>
+              <w:rPr>
+                <w:rFonts w:ascii="Courier New" w:hAnsi="Courier New" w:eastAsia="Courier New"/>
+                <w:sz w:val="15"/>
+              </w:rPr>
+              <w:t xml:space="preserve">            dump1) bat lab4/dump-1.bat ;;</w:t>
+            </w:r>
+          </w:p>
+          <w:p>
+            <w:pPr>
+              <w:spacing w:line="240" w:lineRule="auto"/>
+            </w:pPr>
+            <w:r>
+              <w:rPr>
+                <w:rFonts w:ascii="Courier New" w:hAnsi="Courier New" w:eastAsia="Courier New"/>
+                <w:sz w:val="15"/>
+              </w:rPr>
+              <w:t xml:space="preserve">            dump2) bat lab4/dump-2.bat ;;</w:t>
+            </w:r>
+          </w:p>
+          <w:p>
+            <w:pPr>
+              <w:spacing w:line="240" w:lineRule="auto"/>
+            </w:pPr>
+            <w:r>
+              <w:rPr>
+                <w:rFonts w:ascii="Courier New" w:hAnsi="Courier New" w:eastAsia="Courier New"/>
+                <w:sz w:val="15"/>
+              </w:rPr>
+              <w:t xml:space="preserve">            dump3) bat lab4/dump-3.bat "$3" ;;</w:t>
+            </w:r>
+          </w:p>
+          <w:p>
+            <w:pPr>
+              <w:spacing w:line="240" w:lineRule="auto"/>
+            </w:pPr>
+            <w:r>
+              <w:rPr>
+                <w:rFonts w:ascii="Courier New" w:hAnsi="Courier New" w:eastAsia="Courier New"/>
+                <w:sz w:val="15"/>
+              </w:rPr>
+              <w:t xml:space="preserve">            *) echo "ОШИБКА: ./h lr4 all|base|tasks|dump1|dump2|dump3" ;;</w:t>
+            </w:r>
+          </w:p>
+          <w:p>
+            <w:pPr>
+              <w:spacing w:line="240" w:lineRule="auto"/>
+            </w:pPr>
+            <w:r>
+              <w:rPr>
+                <w:rFonts w:ascii="Courier New" w:hAnsi="Courier New" w:eastAsia="Courier New"/>
+                <w:sz w:val="15"/>
+              </w:rPr>
+              <w:t xml:space="preserve">        esac</w:t>
+            </w:r>
+          </w:p>
+          <w:p>
+            <w:pPr>
+              <w:spacing w:line="240" w:lineRule="auto"/>
+            </w:pPr>
+            <w:r>
+              <w:rPr>
+                <w:rFonts w:ascii="Courier New" w:hAnsi="Courier New" w:eastAsia="Courier New"/>
+                <w:sz w:val="15"/>
+              </w:rPr>
+              <w:t xml:space="preserve">        ;;</w:t>
+            </w:r>
+          </w:p>
+          <w:p>
+            <w:pPr>
+              <w:spacing w:line="240" w:lineRule="auto"/>
+            </w:pPr>
+            <w:r>
+              <w:rPr>
+                <w:rFonts w:ascii="Courier New" w:hAnsi="Courier New" w:eastAsia="Courier New"/>
+                <w:sz w:val="15"/>
+              </w:rPr>
+              <w:t xml:space="preserve"> </w:t>
+            </w:r>
+          </w:p>
+          <w:p>
+            <w:pPr>
+              <w:spacing w:line="240" w:lineRule="auto"/>
+            </w:pPr>
+            <w:r>
+              <w:rPr>
+                <w:rFonts w:ascii="Courier New" w:hAnsi="Courier New" w:eastAsia="Courier New"/>
+                <w:sz w:val="15"/>
+              </w:rPr>
+              <w:t xml:space="preserve">    # ------------------------------ ЛР5 ------------------------------</w:t>
+            </w:r>
+          </w:p>
+          <w:p>
+            <w:pPr>
+              <w:spacing w:line="240" w:lineRule="auto"/>
+            </w:pPr>
+            <w:r>
+              <w:rPr>
+                <w:rFonts w:ascii="Courier New" w:hAnsi="Courier New" w:eastAsia="Courier New"/>
+                <w:sz w:val="15"/>
+              </w:rPr>
+              <w:t xml:space="preserve">    lr5)</w:t>
+            </w:r>
+          </w:p>
+          <w:p>
+            <w:pPr>
+              <w:spacing w:line="240" w:lineRule="auto"/>
+            </w:pPr>
+            <w:r>
+              <w:rPr>
+                <w:rFonts w:ascii="Courier New" w:hAnsi="Courier New" w:eastAsia="Courier New"/>
+                <w:sz w:val="15"/>
+              </w:rPr>
+              <w:t xml:space="preserve">        case "$2" in</w:t>
+            </w:r>
+          </w:p>
+          <w:p>
+            <w:pPr>
+              <w:spacing w:line="240" w:lineRule="auto"/>
+            </w:pPr>
+            <w:r>
+              <w:rPr>
+                <w:rFonts w:ascii="Courier New" w:hAnsi="Courier New" w:eastAsia="Courier New"/>
+                <w:sz w:val="15"/>
+              </w:rPr>
+              <w:t xml:space="preserve">            build) need_variant "$3"; bat lab5/build.bat "$3" "$4" 2&gt;&amp;1 | FIXENC_CP=cp866 perl helper/fixenc.pl ;;</w:t>
+            </w:r>
+          </w:p>
+          <w:p>
+            <w:pPr>
+              <w:spacing w:line="240" w:lineRule="auto"/>
+            </w:pPr>
+            <w:r>
+              <w:rPr>
+                <w:rFonts w:ascii="Courier New" w:hAnsi="Courier New" w:eastAsia="Courier New"/>
+                <w:sz w:val="15"/>
+              </w:rPr>
+              <w:t xml:space="preserve">            20|22) run "lab5/v$2_test.sql" "$3" ;;</w:t>
+            </w:r>
+          </w:p>
+          <w:p>
+            <w:pPr>
+              <w:spacing w:line="240" w:lineRule="auto"/>
+            </w:pPr>
+            <w:r>
+              <w:rPr>
+                <w:rFonts w:ascii="Courier New" w:hAnsi="Courier New" w:eastAsia="Courier New"/>
+                <w:sz w:val="15"/>
+              </w:rPr>
+              <w:t xml:space="preserve">            *) echo "ОШИБКА: ./h lr5 build 20|22  или  ./h lr5 20|22" ;;</w:t>
+            </w:r>
+          </w:p>
+          <w:p>
+            <w:pPr>
+              <w:spacing w:line="240" w:lineRule="auto"/>
+            </w:pPr>
+            <w:r>
+              <w:rPr>
+                <w:rFonts w:ascii="Courier New" w:hAnsi="Courier New" w:eastAsia="Courier New"/>
+                <w:sz w:val="15"/>
+              </w:rPr>
+              <w:t xml:space="preserve">        esac</w:t>
+            </w:r>
+          </w:p>
+          <w:p>
+            <w:pPr>
+              <w:spacing w:line="240" w:lineRule="auto"/>
+            </w:pPr>
+            <w:r>
+              <w:rPr>
+                <w:rFonts w:ascii="Courier New" w:hAnsi="Courier New" w:eastAsia="Courier New"/>
+                <w:sz w:val="15"/>
+              </w:rPr>
+              <w:t xml:space="preserve">        ;;</w:t>
+            </w:r>
+          </w:p>
+          <w:p>
+            <w:pPr>
+              <w:spacing w:line="240" w:lineRule="auto"/>
+            </w:pPr>
+            <w:r>
+              <w:rPr>
+                <w:rFonts w:ascii="Courier New" w:hAnsi="Courier New" w:eastAsia="Courier New"/>
+                <w:sz w:val="15"/>
+              </w:rPr>
+              <w:t xml:space="preserve"> </w:t>
+            </w:r>
+          </w:p>
+          <w:p>
+            <w:pPr>
+              <w:spacing w:line="240" w:lineRule="auto"/>
+            </w:pPr>
+            <w:r>
+              <w:rPr>
+                <w:rFonts w:ascii="Courier New" w:hAnsi="Courier New" w:eastAsia="Courier New"/>
+                <w:sz w:val="15"/>
+              </w:rPr>
+              <w:t xml:space="preserve">    # ------------------------------ ЛР6 ------------------------------</w:t>
+            </w:r>
+          </w:p>
+          <w:p>
+            <w:pPr>
+              <w:spacing w:line="240" w:lineRule="auto"/>
+            </w:pPr>
+            <w:r>
+              <w:rPr>
+                <w:rFonts w:ascii="Courier New" w:hAnsi="Courier New" w:eastAsia="Courier New"/>
+                <w:sz w:val="15"/>
+              </w:rPr>
+              <w:t xml:space="preserve">    lr6)</w:t>
+            </w:r>
+          </w:p>
+          <w:p>
+            <w:pPr>
+              <w:spacing w:line="240" w:lineRule="auto"/>
+            </w:pPr>
+            <w:r>
+              <w:rPr>
+                <w:rFonts w:ascii="Courier New" w:hAnsi="Courier New" w:eastAsia="Courier New"/>
+                <w:sz w:val="15"/>
+              </w:rPr>
+              <w:t xml:space="preserve">        case "$2" in</w:t>
+            </w:r>
+          </w:p>
+          <w:p>
+            <w:pPr>
+              <w:spacing w:line="240" w:lineRule="auto"/>
+            </w:pPr>
+            <w:r>
+              <w:rPr>
+                <w:rFonts w:ascii="Courier New" w:hAnsi="Courier New" w:eastAsia="Courier New"/>
+                <w:sz w:val="15"/>
+              </w:rPr>
+              <w:t xml:space="preserve">            setup)</w:t>
+            </w:r>
+          </w:p>
+          <w:p>
+            <w:pPr>
+              <w:spacing w:line="240" w:lineRule="auto"/>
+            </w:pPr>
+            <w:r>
+              <w:rPr>
+                <w:rFonts w:ascii="Courier New" w:hAnsi="Courier New" w:eastAsia="Courier New"/>
+                <w:sz w:val="15"/>
+              </w:rPr>
+              <w:t xml:space="preserve">                for f in create_DB create_temp1 insert_temp1 select_from_temp1; do</w:t>
+            </w:r>
+          </w:p>
+          <w:p>
+            <w:pPr>
+              <w:spacing w:line="240" w:lineRule="auto"/>
+            </w:pPr>
+            <w:r>
+              <w:rPr>
+                <w:rFonts w:ascii="Courier New" w:hAnsi="Courier New" w:eastAsia="Courier New"/>
+                <w:sz w:val="15"/>
+              </w:rPr>
+              <w:t xml:space="preserve">                    bat lab6/s_TCP.bat "lab6\\SETUP\\$f"</w:t>
+            </w:r>
+          </w:p>
+          <w:p>
+            <w:pPr>
+              <w:spacing w:line="240" w:lineRule="auto"/>
+            </w:pPr>
+            <w:r>
+              <w:rPr>
+                <w:rFonts w:ascii="Courier New" w:hAnsi="Courier New" w:eastAsia="Courier New"/>
+                <w:sz w:val="15"/>
+              </w:rPr>
+              <w:t xml:space="preserve">                done</w:t>
+            </w:r>
+          </w:p>
+          <w:p>
+            <w:pPr>
+              <w:spacing w:line="240" w:lineRule="auto"/>
+            </w:pPr>
+            <w:r>
+              <w:rPr>
+                <w:rFonts w:ascii="Courier New" w:hAnsi="Courier New" w:eastAsia="Courier New"/>
+                <w:sz w:val="15"/>
+              </w:rPr>
+              <w:t xml:space="preserve">                ;;</w:t>
+            </w:r>
+          </w:p>
+          <w:p>
+            <w:pPr>
+              <w:spacing w:line="240" w:lineRule="auto"/>
+            </w:pPr>
+            <w:r>
+              <w:rPr>
+                <w:rFonts w:ascii="Courier New" w:hAnsi="Courier New" w:eastAsia="Courier New"/>
+                <w:sz w:val="15"/>
+              </w:rPr>
+              <w:t xml:space="preserve">            sel2)     bat lab6/COPY/make_sel2.bat ;;</w:t>
+            </w:r>
+          </w:p>
+          <w:p>
+            <w:pPr>
+              <w:spacing w:line="240" w:lineRule="auto"/>
+            </w:pPr>
+            <w:r>
+              <w:rPr>
+                <w:rFonts w:ascii="Courier New" w:hAnsi="Courier New" w:eastAsia="Courier New"/>
+                <w:sz w:val="15"/>
+              </w:rPr>
+              <w:t xml:space="preserve">            createdb) bat lab6/s_TCP.bat 'lab6\COPY\create_DB' ;;</w:t>
+            </w:r>
+          </w:p>
+          <w:p>
+            <w:pPr>
+              <w:spacing w:line="240" w:lineRule="auto"/>
+            </w:pPr>
+            <w:r>
+              <w:rPr>
+                <w:rFonts w:ascii="Courier New" w:hAnsi="Courier New" w:eastAsia="Courier New"/>
+                <w:sz w:val="15"/>
+              </w:rPr>
+              <w:t xml:space="preserve">            copy)     bat lab6/COPY/copy_to_MS_SQL.bat 2&gt;&amp;1 | perl helper/fixenc.pl ;;</w:t>
+            </w:r>
+          </w:p>
+          <w:p>
+            <w:pPr>
+              <w:spacing w:line="240" w:lineRule="auto"/>
+            </w:pPr>
+            <w:r>
+              <w:rPr>
+                <w:rFonts w:ascii="Courier New" w:hAnsi="Courier New" w:eastAsia="Courier New"/>
+                <w:sz w:val="15"/>
+              </w:rPr>
+              <w:t xml:space="preserve">            disp)     bat lab6/COPY/disp.bat ;;</w:t>
+            </w:r>
+          </w:p>
+          <w:p>
+            <w:pPr>
+              <w:spacing w:line="240" w:lineRule="auto"/>
+            </w:pPr>
+            <w:r>
+              <w:rPr>
+                <w:rFonts w:ascii="Courier New" w:hAnsi="Courier New" w:eastAsia="Courier New"/>
+                <w:sz w:val="15"/>
+              </w:rPr>
+              <w:t xml:space="preserve">            v20|v22)</w:t>
+            </w:r>
+          </w:p>
+          <w:p>
+            <w:pPr>
+              <w:spacing w:line="240" w:lineRule="auto"/>
+            </w:pPr>
+            <w:r>
+              <w:rPr>
+                <w:rFonts w:ascii="Courier New" w:hAnsi="Courier New" w:eastAsia="Courier New"/>
+                <w:sz w:val="15"/>
+              </w:rPr>
+              <w:t xml:space="preserve">                need_task "$3"</w:t>
+            </w:r>
+          </w:p>
+          <w:p>
+            <w:pPr>
+              <w:spacing w:line="240" w:lineRule="auto"/>
+            </w:pPr>
+            <w:r>
+              <w:rPr>
+                <w:rFonts w:ascii="Courier New" w:hAnsi="Courier New" w:eastAsia="Courier New"/>
+                <w:sz w:val="15"/>
+              </w:rPr>
+              <w:t xml:space="preserve">                bat lab6/s.bat "lab6\\tasks\\$2_task$3.sql" "$4" "$5" "$6"</w:t>
+            </w:r>
+          </w:p>
+          <w:p>
+            <w:pPr>
+              <w:spacing w:line="240" w:lineRule="auto"/>
+            </w:pPr>
+            <w:r>
+              <w:rPr>
+                <w:rFonts w:ascii="Courier New" w:hAnsi="Courier New" w:eastAsia="Courier New"/>
+                <w:sz w:val="15"/>
+              </w:rPr>
+              <w:t xml:space="preserve">                ;;</w:t>
+            </w:r>
+          </w:p>
+          <w:p>
+            <w:pPr>
+              <w:spacing w:line="240" w:lineRule="auto"/>
+            </w:pPr>
+            <w:r>
+              <w:rPr>
+                <w:rFonts w:ascii="Courier New" w:hAnsi="Courier New" w:eastAsia="Courier New"/>
+                <w:sz w:val="15"/>
+              </w:rPr>
+              <w:t xml:space="preserve">            console)  bat lab6/s0.bat ;;</w:t>
+            </w:r>
+          </w:p>
+          <w:p>
+            <w:pPr>
+              <w:spacing w:line="240" w:lineRule="auto"/>
+            </w:pPr>
+            <w:r>
+              <w:rPr>
+                <w:rFonts w:ascii="Courier New" w:hAnsi="Courier New" w:eastAsia="Courier New"/>
+                <w:sz w:val="15"/>
+              </w:rPr>
+              <w:t xml:space="preserve">            *) echo "ОШИБКА: ./h lr6 setup|sel2|createdb|copy|disp|v20|v22|console" ;;</w:t>
+            </w:r>
+          </w:p>
+          <w:p>
+            <w:pPr>
+              <w:spacing w:line="240" w:lineRule="auto"/>
+            </w:pPr>
+            <w:r>
+              <w:rPr>
+                <w:rFonts w:ascii="Courier New" w:hAnsi="Courier New" w:eastAsia="Courier New"/>
+                <w:sz w:val="15"/>
+              </w:rPr>
+              <w:t xml:space="preserve">        esac</w:t>
+            </w:r>
+          </w:p>
+          <w:p>
+            <w:pPr>
+              <w:spacing w:line="240" w:lineRule="auto"/>
+            </w:pPr>
+            <w:r>
+              <w:rPr>
+                <w:rFonts w:ascii="Courier New" w:hAnsi="Courier New" w:eastAsia="Courier New"/>
+                <w:sz w:val="15"/>
+              </w:rPr>
+              <w:t xml:space="preserve">        ;;</w:t>
+            </w:r>
+          </w:p>
+          <w:p>
+            <w:pPr>
+              <w:spacing w:line="240" w:lineRule="auto"/>
+            </w:pPr>
+            <w:r>
+              <w:rPr>
+                <w:rFonts w:ascii="Courier New" w:hAnsi="Courier New" w:eastAsia="Courier New"/>
+                <w:sz w:val="15"/>
+              </w:rPr>
+              <w:t xml:space="preserve"> </w:t>
+            </w:r>
+          </w:p>
+          <w:p>
+            <w:pPr>
+              <w:spacing w:line="240" w:lineRule="auto"/>
+            </w:pPr>
+            <w:r>
+              <w:rPr>
+                <w:rFonts w:ascii="Courier New" w:hAnsi="Courier New" w:eastAsia="Courier New"/>
+                <w:sz w:val="15"/>
+              </w:rPr>
+              <w:t xml:space="preserve">    # ------------------------------ ЛР7 ------------------------------</w:t>
+            </w:r>
+          </w:p>
+          <w:p>
+            <w:pPr>
+              <w:spacing w:line="240" w:lineRule="auto"/>
+            </w:pPr>
+            <w:r>
+              <w:rPr>
+                <w:rFonts w:ascii="Courier New" w:hAnsi="Courier New" w:eastAsia="Courier New"/>
+                <w:sz w:val="15"/>
+              </w:rPr>
+              <w:t xml:space="preserve">    lr7)</w:t>
+            </w:r>
+          </w:p>
+          <w:p>
+            <w:pPr>
+              <w:spacing w:line="240" w:lineRule="auto"/>
+            </w:pPr>
+            <w:r>
+              <w:rPr>
+                <w:rFonts w:ascii="Courier New" w:hAnsi="Courier New" w:eastAsia="Courier New"/>
+                <w:sz w:val="15"/>
+              </w:rPr>
+              <w:t xml:space="preserve">        case "$2" in</w:t>
+            </w:r>
+          </w:p>
+          <w:p>
+            <w:pPr>
+              <w:spacing w:line="240" w:lineRule="auto"/>
+            </w:pPr>
+            <w:r>
+              <w:rPr>
+                <w:rFonts w:ascii="Courier New" w:hAnsi="Courier New" w:eastAsia="Courier New"/>
+                <w:sz w:val="15"/>
+              </w:rPr>
+              <w:t xml:space="preserve">            create) bat lab7/s.bat 'lab7\create_objects.sql' ;;</w:t>
+            </w:r>
+          </w:p>
+          <w:p>
+            <w:pPr>
+              <w:spacing w:line="240" w:lineRule="auto"/>
+            </w:pPr>
+            <w:r>
+              <w:rPr>
+                <w:rFonts w:ascii="Courier New" w:hAnsi="Courier New" w:eastAsia="Courier New"/>
+                <w:sz w:val="15"/>
+              </w:rPr>
+              <w:t xml:space="preserve">            1)      bat lab7/s.bat 'lab7\calculate1.sql' "$3" "$4" "$5" "$6" "$7" ;;</w:t>
+            </w:r>
+          </w:p>
+          <w:p>
+            <w:pPr>
+              <w:spacing w:line="240" w:lineRule="auto"/>
+            </w:pPr>
+            <w:r>
+              <w:rPr>
+                <w:rFonts w:ascii="Courier New" w:hAnsi="Courier New" w:eastAsia="Courier New"/>
+                <w:sz w:val="15"/>
+              </w:rPr>
+              <w:t xml:space="preserve">            2)      bat lab7/s.bat 'lab7\calculate2.sql' "$3" "$4" "$5" "$6" ;;</w:t>
+            </w:r>
+          </w:p>
+          <w:p>
+            <w:pPr>
+              <w:spacing w:line="240" w:lineRule="auto"/>
+            </w:pPr>
+            <w:r>
+              <w:rPr>
+                <w:rFonts w:ascii="Courier New" w:hAnsi="Courier New" w:eastAsia="Courier New"/>
+                <w:sz w:val="15"/>
+              </w:rPr>
+              <w:t xml:space="preserve">            *) echo "ОШИБКА: ./h lr7 create|1|2" ;;</w:t>
+            </w:r>
+          </w:p>
+          <w:p>
+            <w:pPr>
+              <w:spacing w:line="240" w:lineRule="auto"/>
+            </w:pPr>
+            <w:r>
+              <w:rPr>
+                <w:rFonts w:ascii="Courier New" w:hAnsi="Courier New" w:eastAsia="Courier New"/>
+                <w:sz w:val="15"/>
+              </w:rPr>
+              <w:t xml:space="preserve">        esac</w:t>
+            </w:r>
+          </w:p>
+          <w:p>
+            <w:pPr>
+              <w:spacing w:line="240" w:lineRule="auto"/>
+            </w:pPr>
+            <w:r>
+              <w:rPr>
+                <w:rFonts w:ascii="Courier New" w:hAnsi="Courier New" w:eastAsia="Courier New"/>
+                <w:sz w:val="15"/>
+              </w:rPr>
+              <w:t xml:space="preserve">        ;;</w:t>
+            </w:r>
+          </w:p>
+          <w:p>
+            <w:pPr>
+              <w:spacing w:line="240" w:lineRule="auto"/>
+            </w:pPr>
+            <w:r>
+              <w:rPr>
+                <w:rFonts w:ascii="Courier New" w:hAnsi="Courier New" w:eastAsia="Courier New"/>
+                <w:sz w:val="15"/>
+              </w:rPr>
+              <w:t xml:space="preserve"> </w:t>
+            </w:r>
+          </w:p>
+          <w:p>
+            <w:pPr>
+              <w:spacing w:line="240" w:lineRule="auto"/>
+            </w:pPr>
+            <w:r>
+              <w:rPr>
+                <w:rFonts w:ascii="Courier New" w:hAnsi="Courier New" w:eastAsia="Courier New"/>
+                <w:sz w:val="15"/>
+              </w:rPr>
+              <w:t xml:space="preserve">    # ------------------------------ ЛР8 ------------------------------</w:t>
+            </w:r>
+          </w:p>
+          <w:p>
+            <w:pPr>
+              <w:spacing w:line="240" w:lineRule="auto"/>
+            </w:pPr>
+            <w:r>
+              <w:rPr>
+                <w:rFonts w:ascii="Courier New" w:hAnsi="Courier New" w:eastAsia="Courier New"/>
+                <w:sz w:val="15"/>
+              </w:rPr>
+              <w:t xml:space="preserve">    lr8)</w:t>
+            </w:r>
+          </w:p>
+          <w:p>
+            <w:pPr>
+              <w:spacing w:line="240" w:lineRule="auto"/>
+            </w:pPr>
+            <w:r>
+              <w:rPr>
+                <w:rFonts w:ascii="Courier New" w:hAnsi="Courier New" w:eastAsia="Courier New"/>
+                <w:sz w:val="15"/>
+              </w:rPr>
+              <w:t xml:space="preserve">        case "$2" in</w:t>
+            </w:r>
+          </w:p>
+          <w:p>
+            <w:pPr>
+              <w:spacing w:line="240" w:lineRule="auto"/>
+            </w:pPr>
+            <w:r>
+              <w:rPr>
+                <w:rFonts w:ascii="Courier New" w:hAnsi="Courier New" w:eastAsia="Courier New"/>
+                <w:sz w:val="15"/>
+              </w:rPr>
+              <w:t xml:space="preserve">            build) bat lab8/v20/cs.bat 2&gt;&amp;1 | FIXENC_CP=cp866 perl helper/fixenc.pl ;;</w:t>
+            </w:r>
+          </w:p>
+          <w:p>
+            <w:pPr>
+              <w:spacing w:line="240" w:lineRule="auto"/>
+            </w:pPr>
+            <w:r>
+              <w:rPr>
+                <w:rFonts w:ascii="Courier New" w:hAnsi="Courier New" w:eastAsia="Courier New"/>
+                <w:sz w:val="15"/>
+              </w:rPr>
+              <w:t xml:space="preserve">            20)    shift 2; bat lab8/v20/run.bat "$@" ;;</w:t>
+            </w:r>
+          </w:p>
+          <w:p>
+            <w:pPr>
+              <w:spacing w:line="240" w:lineRule="auto"/>
+            </w:pPr>
+            <w:r>
+              <w:rPr>
+                <w:rFonts w:ascii="Courier New" w:hAnsi="Courier New" w:eastAsia="Courier New"/>
+                <w:sz w:val="15"/>
+              </w:rPr>
+              <w:t xml:space="preserve">            22)    shift 2; bat lab8/v22/run.bat "$@" ;;</w:t>
+            </w:r>
+          </w:p>
+          <w:p>
+            <w:pPr>
+              <w:spacing w:line="240" w:lineRule="auto"/>
+            </w:pPr>
+            <w:r>
+              <w:rPr>
+                <w:rFonts w:ascii="Courier New" w:hAnsi="Courier New" w:eastAsia="Courier New"/>
+                <w:sz w:val="15"/>
+              </w:rPr>
+              <w:t xml:space="preserve">            *) echo "ОШИБКА: ./h lr8 build|20|22" ;;</w:t>
+            </w:r>
+          </w:p>
+          <w:p>
+            <w:pPr>
+              <w:spacing w:line="240" w:lineRule="auto"/>
+            </w:pPr>
+            <w:r>
+              <w:rPr>
+                <w:rFonts w:ascii="Courier New" w:hAnsi="Courier New" w:eastAsia="Courier New"/>
+                <w:sz w:val="15"/>
+              </w:rPr>
+              <w:t xml:space="preserve">        esac</w:t>
+            </w:r>
+          </w:p>
+          <w:p>
+            <w:pPr>
+              <w:spacing w:line="240" w:lineRule="auto"/>
+            </w:pPr>
+            <w:r>
+              <w:rPr>
+                <w:rFonts w:ascii="Courier New" w:hAnsi="Courier New" w:eastAsia="Courier New"/>
+                <w:sz w:val="15"/>
+              </w:rPr>
+              <w:t xml:space="preserve">        ;;</w:t>
+            </w:r>
+          </w:p>
+          <w:p>
+            <w:pPr>
+              <w:spacing w:line="240" w:lineRule="auto"/>
+            </w:pPr>
+            <w:r>
+              <w:rPr>
+                <w:rFonts w:ascii="Courier New" w:hAnsi="Courier New" w:eastAsia="Courier New"/>
+                <w:sz w:val="15"/>
+              </w:rPr>
+              <w:t xml:space="preserve"> </w:t>
+            </w:r>
+          </w:p>
+          <w:p>
+            <w:pPr>
+              <w:spacing w:line="240" w:lineRule="auto"/>
+            </w:pPr>
+            <w:r>
+              <w:rPr>
+                <w:rFonts w:ascii="Courier New" w:hAnsi="Courier New" w:eastAsia="Courier New"/>
+                <w:sz w:val="15"/>
+              </w:rPr>
+              <w:t xml:space="preserve">    reports) shift; (cd reports &amp;&amp; python make_reports.py "$@") ;;</w:t>
+            </w:r>
+          </w:p>
+          <w:p>
+            <w:pPr>
+              <w:spacing w:line="240" w:lineRule="auto"/>
+            </w:pPr>
+            <w:r>
+              <w:rPr>
+                <w:rFonts w:ascii="Courier New" w:hAnsi="Courier New" w:eastAsia="Courier New"/>
+                <w:sz w:val="15"/>
+              </w:rPr>
+              <w:t xml:space="preserve">    psql) psql -X ;;</w:t>
+            </w:r>
+          </w:p>
+          <w:p>
+            <w:pPr>
+              <w:spacing w:line="240" w:lineRule="auto"/>
+            </w:pPr>
+            <w:r>
+              <w:rPr>
+                <w:rFonts w:ascii="Courier New" w:hAnsi="Courier New" w:eastAsia="Courier New"/>
+                <w:sz w:val="15"/>
+              </w:rPr>
+              <w:t xml:space="preserve">    *) echo "ОШИБКА: Неизвестная команда $1 (./h - список команд)" ;;</w:t>
+            </w:r>
+          </w:p>
+          <w:p>
+            <w:pPr>
+              <w:spacing w:line="240" w:lineRule="auto"/>
+            </w:pPr>
+            <w:r>
+              <w:rPr>
+                <w:rFonts w:ascii="Courier New" w:hAnsi="Courier New" w:eastAsia="Courier New"/>
+                <w:sz w:val="15"/>
+              </w:rPr>
+              <w:t>esac</w:t>
+            </w:r>
+          </w:p>
+        </w:tc>
+      </w:tr>
+    </w:tbl>
+    <w:p>
+      <w:pPr>
+        <w:spacing w:after="40"/>
+      </w:pPr>
     </w:p>
     <w:sectPr>
       <w:pgSz w:w="11906" w:h="16838"/>

</xml_diff>